<commit_message>
Báo Cáo Nghiện Data Edit
</commit_message>
<xml_diff>
--- a/docs/Báo Cáo NghienData.docx
+++ b/docs/Báo Cáo NghienData.docx
@@ -207,172 +207,291 @@
                               </w:p>
                               <w:p>
                                 <w:pPr>
+                                  <w:spacing w:before="240" w:after="0"/>
+                                  <w:ind w:right="513"/>
                                   <w:jc w:val="center"/>
                                   <w:rPr>
-                                    <w:rFonts w:asciiTheme="majorHAnsi" w:hAnsiTheme="majorHAnsi"/>
+                                    <w:rFonts w:cs="Times New Roman"/>
                                     <w:b/>
-                                    <w:sz w:val="34"/>
-                                    <w:szCs w:val="28"/>
+                                    <w:color w:val="002060"/>
+                                    <w:sz w:val="56"/>
+                                    <w:szCs w:val="56"/>
                                   </w:rPr>
                                 </w:pPr>
                                 <w:r>
                                   <w:rPr>
-                                    <w:rFonts w:asciiTheme="majorHAnsi" w:hAnsiTheme="majorHAnsi"/>
+                                    <w:rFonts w:cs="Times New Roman"/>
                                     <w:b/>
-                                    <w:sz w:val="34"/>
-                                    <w:szCs w:val="28"/>
+                                    <w:color w:val="002060"/>
+                                    <w:sz w:val="56"/>
+                                    <w:szCs w:val="56"/>
                                   </w:rPr>
-                                  <w:t>BÁO CÁO DỰ ÁN TỐT NGHIỆP</w:t>
+                                  <w:t>BÁO CÁO</w:t>
+                                </w:r>
+                                <w:r>
+                                  <w:rPr>
+                                    <w:rFonts w:cs="Times New Roman"/>
+                                    <w:b/>
+                                    <w:color w:val="002060"/>
+                                    <w:sz w:val="56"/>
+                                    <w:szCs w:val="56"/>
+                                  </w:rPr>
+                                  <w:t xml:space="preserve"> DỰ ÁN TỐT NGHIỆP</w:t>
                                 </w:r>
                               </w:p>
                               <w:p>
                                 <w:pPr>
+                                  <w:spacing w:after="360"/>
+                                  <w:ind w:right="513"/>
                                   <w:jc w:val="center"/>
                                   <w:rPr>
-                                    <w:rFonts w:asciiTheme="majorHAnsi" w:hAnsiTheme="majorHAnsi"/>
+                                    <w:rFonts w:cs="Times New Roman"/>
                                     <w:b/>
+                                    <w:color w:val="5B9BD5" w:themeColor="accent1"/>
                                     <w:sz w:val="52"/>
-                                    <w:szCs w:val="28"/>
+                                    <w:szCs w:val="52"/>
+                                    <w14:shadow w14:blurRad="69850" w14:dist="43180" w14:dir="5400000" w14:sx="0" w14:sy="0" w14:kx="0" w14:ky="0" w14:algn="none">
+                                      <w14:srgbClr w14:val="000000">
+                                        <w14:alpha w14:val="35000"/>
+                                      </w14:srgbClr>
+                                    </w14:shadow>
+                                    <w14:textOutline w14:w="952" w14:cap="flat" w14:cmpd="sng" w14:algn="ctr">
+                                      <w14:noFill/>
+                                      <w14:prstDash w14:val="solid"/>
+                                      <w14:round/>
+                                    </w14:textOutline>
+                                    <w14:textFill>
+                                      <w14:gradFill>
+                                        <w14:gsLst>
+                                          <w14:gs w14:pos="0">
+                                            <w14:schemeClr w14:val="accent6">
+                                              <w14:shade w14:val="20000"/>
+                                              <w14:satMod w14:val="200000"/>
+                                            </w14:schemeClr>
+                                          </w14:gs>
+                                          <w14:gs w14:pos="78000">
+                                            <w14:schemeClr w14:val="accent6">
+                                              <w14:tint w14:val="90000"/>
+                                              <w14:shade w14:val="89000"/>
+                                              <w14:satMod w14:val="220000"/>
+                                            </w14:schemeClr>
+                                          </w14:gs>
+                                          <w14:gs w14:pos="100000">
+                                            <w14:schemeClr w14:val="accent6">
+                                              <w14:tint w14:val="12000"/>
+                                              <w14:satMod w14:val="255000"/>
+                                            </w14:schemeClr>
+                                          </w14:gs>
+                                        </w14:gsLst>
+                                        <w14:lin w14:ang="5400000" w14:scaled="0"/>
+                                      </w14:gradFill>
+                                    </w14:textFill>
                                   </w:rPr>
                                 </w:pPr>
                                 <w:r>
                                   <w:rPr>
-                                    <w:rFonts w:asciiTheme="majorHAnsi" w:hAnsiTheme="majorHAnsi"/>
-                                    <w:b/>
-                                    <w:sz w:val="34"/>
-                                    <w:szCs w:val="28"/>
+                                    <w:rFonts w:cs="Times New Roman"/>
+                                    <w:color w:val="000000" w:themeColor="text1"/>
+                                    <w:sz w:val="40"/>
+                                    <w:szCs w:val="40"/>
+                                    <w14:shadow w14:blurRad="38100" w14:dist="19050" w14:dir="2700000" w14:sx="100000" w14:sy="100000" w14:kx="0" w14:ky="0" w14:algn="tl">
+                                      <w14:schemeClr w14:val="dk1">
+                                        <w14:alpha w14:val="60000"/>
+                                      </w14:schemeClr>
+                                    </w14:shadow>
+                                    <w14:textOutline w14:w="0" w14:cap="flat" w14:cmpd="sng" w14:algn="ctr">
+                                      <w14:noFill/>
+                                      <w14:prstDash w14:val="solid"/>
+                                      <w14:round/>
+                                    </w14:textOutline>
                                   </w:rPr>
-                                  <w:t>Chuyên ngành Xử Lý Dữ Liệu</w:t>
+                                  <w:t xml:space="preserve">Chuyên </w:t>
                                 </w:r>
+                                <w:proofErr w:type="spellStart"/>
                                 <w:r>
                                   <w:rPr>
-                                    <w:rFonts w:asciiTheme="majorHAnsi" w:hAnsiTheme="majorHAnsi"/>
-                                    <w:b/>
-                                    <w:sz w:val="34"/>
-                                    <w:szCs w:val="28"/>
+                                    <w:rFonts w:cs="Times New Roman"/>
+                                    <w:color w:val="000000" w:themeColor="text1"/>
+                                    <w:sz w:val="40"/>
+                                    <w:szCs w:val="40"/>
+                                    <w14:shadow w14:blurRad="38100" w14:dist="19050" w14:dir="2700000" w14:sx="100000" w14:sy="100000" w14:kx="0" w14:ky="0" w14:algn="tl">
+                                      <w14:schemeClr w14:val="dk1">
+                                        <w14:alpha w14:val="60000"/>
+                                      </w14:schemeClr>
+                                    </w14:shadow>
+                                    <w14:textOutline w14:w="0" w14:cap="flat" w14:cmpd="sng" w14:algn="ctr">
+                                      <w14:noFill/>
+                                      <w14:prstDash w14:val="solid"/>
+                                      <w14:round/>
+                                    </w14:textOutline>
                                   </w:rPr>
-                                  <w:br/>
+                                  <w:t>ngành</w:t>
                                 </w:r>
+                                <w:proofErr w:type="spellEnd"/>
                                 <w:r>
                                   <w:rPr>
-                                    <w:rFonts w:ascii="Segoe UI" w:hAnsi="Segoe UI" w:cs="Segoe UI"/>
-                                    <w:color w:val="081B3A"/>
-                                    <w:spacing w:val="3"/>
-                                    <w:sz w:val="23"/>
-                                    <w:szCs w:val="23"/>
-                                    <w:shd w:val="clear" w:color="auto" w:fill="FFFFFF"/>
+                                    <w:rFonts w:cs="Times New Roman"/>
+                                    <w:color w:val="000000" w:themeColor="text1"/>
+                                    <w:sz w:val="40"/>
+                                    <w:szCs w:val="40"/>
+                                    <w14:shadow w14:blurRad="38100" w14:dist="19050" w14:dir="2700000" w14:sx="100000" w14:sy="100000" w14:kx="0" w14:ky="0" w14:algn="tl">
+                                      <w14:schemeClr w14:val="dk1">
+                                        <w14:alpha w14:val="60000"/>
+                                      </w14:schemeClr>
+                                    </w14:shadow>
+                                    <w14:textOutline w14:w="0" w14:cap="flat" w14:cmpd="sng" w14:algn="ctr">
+                                      <w14:noFill/>
+                                      <w14:prstDash w14:val="solid"/>
+                                      <w14:round/>
+                                    </w14:textOutline>
                                   </w:rPr>
                                   <w:t xml:space="preserve"> </w:t>
                                 </w:r>
                                 <w:proofErr w:type="spellStart"/>
                                 <w:r>
                                   <w:rPr>
-                                    <w:rFonts w:ascii="Segoe UI" w:hAnsi="Segoe UI" w:cs="Segoe UI"/>
-                                    <w:b/>
-                                    <w:spacing w:val="3"/>
-                                    <w:sz w:val="46"/>
-                                    <w:szCs w:val="46"/>
-                                    <w:shd w:val="clear" w:color="auto" w:fill="FFFFFF"/>
+                                    <w:rFonts w:cs="Times New Roman"/>
+                                    <w:color w:val="000000" w:themeColor="text1"/>
+                                    <w:sz w:val="40"/>
+                                    <w:szCs w:val="40"/>
+                                    <w14:shadow w14:blurRad="38100" w14:dist="19050" w14:dir="2700000" w14:sx="100000" w14:sy="100000" w14:kx="0" w14:ky="0" w14:algn="tl">
+                                      <w14:schemeClr w14:val="dk1">
+                                        <w14:alpha w14:val="60000"/>
+                                      </w14:schemeClr>
+                                    </w14:shadow>
+                                    <w14:textOutline w14:w="0" w14:cap="flat" w14:cmpd="sng" w14:algn="ctr">
+                                      <w14:noFill/>
+                                      <w14:prstDash w14:val="solid"/>
+                                      <w14:round/>
+                                    </w14:textOutline>
                                   </w:rPr>
-                                  <w:t>Phân</w:t>
+                                  <w:t>Xử</w:t>
                                 </w:r>
                                 <w:proofErr w:type="spellEnd"/>
                                 <w:r>
                                   <w:rPr>
-                                    <w:rFonts w:ascii="Segoe UI" w:hAnsi="Segoe UI" w:cs="Segoe UI"/>
-                                    <w:b/>
-                                    <w:spacing w:val="3"/>
-                                    <w:sz w:val="46"/>
-                                    <w:szCs w:val="46"/>
-                                    <w:shd w:val="clear" w:color="auto" w:fill="FFFFFF"/>
+                                    <w:rFonts w:cs="Times New Roman"/>
+                                    <w:color w:val="000000" w:themeColor="text1"/>
+                                    <w:sz w:val="40"/>
+                                    <w:szCs w:val="40"/>
+                                    <w14:shadow w14:blurRad="38100" w14:dist="19050" w14:dir="2700000" w14:sx="100000" w14:sy="100000" w14:kx="0" w14:ky="0" w14:algn="tl">
+                                      <w14:schemeClr w14:val="dk1">
+                                        <w14:alpha w14:val="60000"/>
+                                      </w14:schemeClr>
+                                    </w14:shadow>
+                                    <w14:textOutline w14:w="0" w14:cap="flat" w14:cmpd="sng" w14:algn="ctr">
+                                      <w14:noFill/>
+                                      <w14:prstDash w14:val="solid"/>
+                                      <w14:round/>
+                                    </w14:textOutline>
                                   </w:rPr>
-                                  <w:t xml:space="preserve"> </w:t>
+                                  <w:t xml:space="preserve"> Lý </w:t>
                                 </w:r>
                                 <w:proofErr w:type="spellStart"/>
                                 <w:r>
                                   <w:rPr>
-                                    <w:rFonts w:ascii="Segoe UI" w:hAnsi="Segoe UI" w:cs="Segoe UI"/>
-                                    <w:b/>
-                                    <w:spacing w:val="3"/>
-                                    <w:sz w:val="46"/>
-                                    <w:szCs w:val="46"/>
-                                    <w:shd w:val="clear" w:color="auto" w:fill="FFFFFF"/>
+                                    <w:rFonts w:cs="Times New Roman"/>
+                                    <w:color w:val="000000" w:themeColor="text1"/>
+                                    <w:sz w:val="40"/>
+                                    <w:szCs w:val="40"/>
+                                    <w14:shadow w14:blurRad="38100" w14:dist="19050" w14:dir="2700000" w14:sx="100000" w14:sy="100000" w14:kx="0" w14:ky="0" w14:algn="tl">
+                                      <w14:schemeClr w14:val="dk1">
+                                        <w14:alpha w14:val="60000"/>
+                                      </w14:schemeClr>
+                                    </w14:shadow>
+                                    <w14:textOutline w14:w="0" w14:cap="flat" w14:cmpd="sng" w14:algn="ctr">
+                                      <w14:noFill/>
+                                      <w14:prstDash w14:val="solid"/>
+                                      <w14:round/>
+                                    </w14:textOutline>
                                   </w:rPr>
-                                  <w:t>Tích</w:t>
+                                  <w:t>Dữ</w:t>
                                 </w:r>
                                 <w:proofErr w:type="spellEnd"/>
                                 <w:r>
                                   <w:rPr>
-                                    <w:rFonts w:ascii="Segoe UI" w:hAnsi="Segoe UI" w:cs="Segoe UI"/>
-                                    <w:b/>
-                                    <w:spacing w:val="3"/>
-                                    <w:sz w:val="46"/>
-                                    <w:szCs w:val="46"/>
-                                    <w:shd w:val="clear" w:color="auto" w:fill="FFFFFF"/>
+                                    <w:rFonts w:cs="Times New Roman"/>
+                                    <w:color w:val="000000" w:themeColor="text1"/>
+                                    <w:sz w:val="40"/>
+                                    <w:szCs w:val="40"/>
+                                    <w14:shadow w14:blurRad="38100" w14:dist="19050" w14:dir="2700000" w14:sx="100000" w14:sy="100000" w14:kx="0" w14:ky="0" w14:algn="tl">
+                                      <w14:schemeClr w14:val="dk1">
+                                        <w14:alpha w14:val="60000"/>
+                                      </w14:schemeClr>
+                                    </w14:shadow>
+                                    <w14:textOutline w14:w="0" w14:cap="flat" w14:cmpd="sng" w14:algn="ctr">
+                                      <w14:noFill/>
+                                      <w14:prstDash w14:val="solid"/>
+                                      <w14:round/>
+                                    </w14:textOutline>
                                   </w:rPr>
-                                  <w:t xml:space="preserve"> </w:t>
+                                  <w:t xml:space="preserve"> Liệu</w:t>
                                 </w:r>
-                                <w:proofErr w:type="spellStart"/>
                                 <w:r>
                                   <w:rPr>
-                                    <w:rFonts w:ascii="Segoe UI" w:hAnsi="Segoe UI" w:cs="Segoe UI"/>
-                                    <w:b/>
-                                    <w:spacing w:val="3"/>
-                                    <w:sz w:val="46"/>
-                                    <w:szCs w:val="46"/>
-                                    <w:shd w:val="clear" w:color="auto" w:fill="FFFFFF"/>
+                                    <w:rFonts w:asciiTheme="majorHAnsi" w:hAnsiTheme="majorHAnsi"/>
+                                    <w:color w:val="000000" w:themeColor="text1"/>
+                                    <w:sz w:val="34"/>
+                                    <w:szCs w:val="28"/>
+                                    <w14:shadow w14:blurRad="38100" w14:dist="19050" w14:dir="2700000" w14:sx="100000" w14:sy="100000" w14:kx="0" w14:ky="0" w14:algn="tl">
+                                      <w14:schemeClr w14:val="dk1">
+                                        <w14:alpha w14:val="60000"/>
+                                      </w14:schemeClr>
+                                    </w14:shadow>
+                                    <w14:textOutline w14:w="0" w14:cap="flat" w14:cmpd="sng" w14:algn="ctr">
+                                      <w14:noFill/>
+                                      <w14:prstDash w14:val="solid"/>
+                                      <w14:round/>
+                                    </w14:textOutline>
                                   </w:rPr>
-                                  <w:t>Rủi</w:t>
+                                  <w:br/>
                                 </w:r>
-                                <w:proofErr w:type="spellEnd"/>
                                 <w:r>
                                   <w:rPr>
-                                    <w:rFonts w:ascii="Segoe UI" w:hAnsi="Segoe UI" w:cs="Segoe UI"/>
+                                    <w:rFonts w:cs="Times New Roman"/>
                                     <w:b/>
-                                    <w:spacing w:val="3"/>
-                                    <w:sz w:val="46"/>
-                                    <w:szCs w:val="46"/>
-                                    <w:shd w:val="clear" w:color="auto" w:fill="FFFFFF"/>
+                                    <w:color w:val="5B9BD5" w:themeColor="accent1"/>
+                                    <w:sz w:val="52"/>
+                                    <w:szCs w:val="52"/>
+                                    <w14:shadow w14:blurRad="69850" w14:dist="43180" w14:dir="5400000" w14:sx="0" w14:sy="0" w14:kx="0" w14:ky="0" w14:algn="none">
+                                      <w14:srgbClr w14:val="000000">
+                                        <w14:alpha w14:val="35000"/>
+                                      </w14:srgbClr>
+                                    </w14:shadow>
+                                    <w14:textOutline w14:w="952" w14:cap="flat" w14:cmpd="sng" w14:algn="ctr">
+                                      <w14:noFill/>
+                                      <w14:prstDash w14:val="solid"/>
+                                      <w14:round/>
+                                    </w14:textOutline>
+                                    <w14:textFill>
+                                      <w14:gradFill>
+                                        <w14:gsLst>
+                                          <w14:gs w14:pos="0">
+                                            <w14:schemeClr w14:val="accent6">
+                                              <w14:shade w14:val="20000"/>
+                                              <w14:satMod w14:val="200000"/>
+                                            </w14:schemeClr>
+                                          </w14:gs>
+                                          <w14:gs w14:pos="78000">
+                                            <w14:schemeClr w14:val="accent6">
+                                              <w14:tint w14:val="90000"/>
+                                              <w14:shade w14:val="89000"/>
+                                              <w14:satMod w14:val="220000"/>
+                                            </w14:schemeClr>
+                                          </w14:gs>
+                                          <w14:gs w14:pos="100000">
+                                            <w14:schemeClr w14:val="accent6">
+                                              <w14:tint w14:val="12000"/>
+                                              <w14:satMod w14:val="255000"/>
+                                            </w14:schemeClr>
+                                          </w14:gs>
+                                        </w14:gsLst>
+                                        <w14:lin w14:ang="5400000" w14:scaled="0"/>
+                                      </w14:gradFill>
+                                    </w14:textFill>
                                   </w:rPr>
-                                  <w:t xml:space="preserve"> Ro </w:t>
+                                  <w:t>&lt;PHÂN TÍCH RỦI RO TÍN DỤNG&gt;</w:t>
                                 </w:r>
-                                <w:proofErr w:type="spellStart"/>
-                                <w:r>
-                                  <w:rPr>
-                                    <w:rFonts w:ascii="Segoe UI" w:hAnsi="Segoe UI" w:cs="Segoe UI"/>
-                                    <w:b/>
-                                    <w:spacing w:val="3"/>
-                                    <w:sz w:val="46"/>
-                                    <w:szCs w:val="46"/>
-                                    <w:shd w:val="clear" w:color="auto" w:fill="FFFFFF"/>
-                                  </w:rPr>
-                                  <w:t>Tín</w:t>
-                                </w:r>
-                                <w:proofErr w:type="spellEnd"/>
-                                <w:r>
-                                  <w:rPr>
-                                    <w:rFonts w:ascii="Segoe UI" w:hAnsi="Segoe UI" w:cs="Segoe UI"/>
-                                    <w:b/>
-                                    <w:spacing w:val="3"/>
-                                    <w:sz w:val="46"/>
-                                    <w:szCs w:val="46"/>
-                                    <w:shd w:val="clear" w:color="auto" w:fill="FFFFFF"/>
-                                  </w:rPr>
-                                  <w:t xml:space="preserve"> </w:t>
-                                </w:r>
-                                <w:proofErr w:type="spellStart"/>
-                                <w:r>
-                                  <w:rPr>
-                                    <w:rFonts w:ascii="Segoe UI" w:hAnsi="Segoe UI" w:cs="Segoe UI"/>
-                                    <w:b/>
-                                    <w:spacing w:val="3"/>
-                                    <w:sz w:val="46"/>
-                                    <w:szCs w:val="46"/>
-                                    <w:shd w:val="clear" w:color="auto" w:fill="FFFFFF"/>
-                                  </w:rPr>
-                                  <w:t>Dụng</w:t>
-                                </w:r>
-                                <w:proofErr w:type="spellEnd"/>
                               </w:p>
                               <w:p>
                                 <w:pPr>
@@ -405,9 +524,33 @@
                                     <w:sz w:val="40"/>
                                     <w:szCs w:val="40"/>
                                   </w:rPr>
-                                  <w:t>NghienData</w:t>
+                                  <w:t>Nghi</w:t>
+                                </w:r>
+                                <w:r>
+                                  <w:rPr>
+                                    <w:sz w:val="40"/>
+                                    <w:szCs w:val="40"/>
+                                  </w:rPr>
+                                  <w:t>ện</w:t>
                                 </w:r>
                                 <w:proofErr w:type="spellEnd"/>
+                                <w:r>
+                                  <w:rPr>
+                                    <w:sz w:val="40"/>
+                                    <w:szCs w:val="40"/>
+                                  </w:rPr>
+                                  <w:t xml:space="preserve"> Data</w:t>
+                                </w:r>
+                              </w:p>
+                              <w:p>
+                                <w:pPr>
+                                  <w:spacing w:after="0"/>
+                                  <w:jc w:val="center"/>
+                                  <w:rPr>
+                                    <w:sz w:val="40"/>
+                                    <w:szCs w:val="40"/>
+                                  </w:rPr>
+                                </w:pPr>
                               </w:p>
                               <w:p>
                                 <w:pPr>
@@ -419,207 +562,478 @@
                                   </w:rPr>
                                 </w:pPr>
                               </w:p>
-                              <w:p>
-                                <w:pPr>
-                                  <w:spacing w:after="0"/>
-                                  <w:rPr>
-                                    <w:sz w:val="32"/>
-                                    <w:szCs w:val="32"/>
-                                  </w:rPr>
-                                </w:pPr>
-                                <w:r>
-                                  <w:rPr>
-                                    <w:sz w:val="32"/>
-                                    <w:szCs w:val="32"/>
-                                  </w:rPr>
-                                  <w:t xml:space="preserve">Các </w:t>
-                                </w:r>
-                                <w:proofErr w:type="spellStart"/>
-                                <w:r>
-                                  <w:rPr>
-                                    <w:sz w:val="32"/>
-                                    <w:szCs w:val="32"/>
-                                  </w:rPr>
-                                  <w:t>thành</w:t>
-                                </w:r>
-                                <w:proofErr w:type="spellEnd"/>
-                                <w:r>
-                                  <w:rPr>
-                                    <w:sz w:val="32"/>
-                                    <w:szCs w:val="32"/>
-                                  </w:rPr>
-                                  <w:t xml:space="preserve"> </w:t>
-                                </w:r>
-                                <w:proofErr w:type="spellStart"/>
-                                <w:r>
-                                  <w:rPr>
-                                    <w:sz w:val="32"/>
-                                    <w:szCs w:val="32"/>
-                                  </w:rPr>
-                                  <w:t>viên</w:t>
-                                </w:r>
-                                <w:proofErr w:type="spellEnd"/>
-                                <w:r>
-                                  <w:rPr>
-                                    <w:sz w:val="32"/>
-                                    <w:szCs w:val="32"/>
-                                  </w:rPr>
-                                  <w:t>:</w:t>
-                                </w:r>
-                              </w:p>
-                              <w:p>
-                                <w:pPr>
-                                  <w:spacing w:after="0"/>
-                                  <w:rPr>
-                                    <w:sz w:val="32"/>
-                                    <w:szCs w:val="32"/>
-                                  </w:rPr>
-                                </w:pPr>
-                                <w:r>
-                                  <w:rPr>
-                                    <w:sz w:val="32"/>
-                                    <w:szCs w:val="32"/>
-                                  </w:rPr>
-                                  <w:t>Nguyễn Phan Hoàng Tùng</w:t>
-                                </w:r>
-                              </w:p>
-                              <w:p>
-                                <w:pPr>
-                                  <w:spacing w:after="0"/>
-                                  <w:rPr>
-                                    <w:sz w:val="32"/>
-                                    <w:szCs w:val="32"/>
-                                  </w:rPr>
-                                </w:pPr>
-                                <w:proofErr w:type="spellStart"/>
-                                <w:r>
-                                  <w:rPr>
-                                    <w:sz w:val="32"/>
-                                    <w:szCs w:val="32"/>
-                                  </w:rPr>
-                                  <w:t>Trần</w:t>
-                                </w:r>
-                                <w:proofErr w:type="spellEnd"/>
-                                <w:r>
-                                  <w:rPr>
-                                    <w:sz w:val="32"/>
-                                    <w:szCs w:val="32"/>
-                                  </w:rPr>
-                                  <w:t xml:space="preserve"> </w:t>
-                                </w:r>
-                                <w:proofErr w:type="spellStart"/>
-                                <w:r>
-                                  <w:rPr>
-                                    <w:sz w:val="32"/>
-                                    <w:szCs w:val="32"/>
-                                  </w:rPr>
-                                  <w:t>Hưng</w:t>
-                                </w:r>
-                                <w:proofErr w:type="spellEnd"/>
-                                <w:r>
-                                  <w:rPr>
-                                    <w:sz w:val="32"/>
-                                    <w:szCs w:val="32"/>
-                                  </w:rPr>
-                                  <w:t xml:space="preserve"> Thịnh</w:t>
-                                </w:r>
-                              </w:p>
-                              <w:p>
-                                <w:pPr>
-                                  <w:spacing w:after="0"/>
-                                  <w:rPr>
-                                    <w:sz w:val="32"/>
-                                    <w:szCs w:val="32"/>
-                                  </w:rPr>
-                                </w:pPr>
-                                <w:r>
-                                  <w:rPr>
-                                    <w:sz w:val="32"/>
-                                    <w:szCs w:val="32"/>
-                                  </w:rPr>
-                                  <w:t>Lê Thị Tuyết Trinh</w:t>
-                                </w:r>
-                              </w:p>
-                              <w:p>
-                                <w:pPr>
-                                  <w:spacing w:after="0"/>
-                                  <w:rPr>
-                                    <w:sz w:val="32"/>
-                                    <w:szCs w:val="32"/>
-                                  </w:rPr>
-                                </w:pPr>
-                                <w:r>
-                                  <w:rPr>
-                                    <w:sz w:val="32"/>
-                                    <w:szCs w:val="32"/>
-                                  </w:rPr>
-                                  <w:t xml:space="preserve">Dương </w:t>
-                                </w:r>
-                                <w:proofErr w:type="spellStart"/>
-                                <w:r>
-                                  <w:rPr>
-                                    <w:sz w:val="32"/>
-                                    <w:szCs w:val="32"/>
-                                  </w:rPr>
-                                  <w:t>Bách</w:t>
-                                </w:r>
-                                <w:proofErr w:type="spellEnd"/>
-                                <w:r>
-                                  <w:rPr>
-                                    <w:sz w:val="32"/>
-                                    <w:szCs w:val="32"/>
-                                  </w:rPr>
-                                  <w:t xml:space="preserve"> Sang</w:t>
-                                </w:r>
-                              </w:p>
-                              <w:p>
-                                <w:pPr>
-                                  <w:spacing w:after="0"/>
-                                  <w:rPr>
-                                    <w:sz w:val="32"/>
-                                    <w:szCs w:val="32"/>
-                                  </w:rPr>
-                                </w:pPr>
-                                <w:r>
-                                  <w:rPr>
-                                    <w:sz w:val="32"/>
-                                    <w:szCs w:val="32"/>
-                                  </w:rPr>
-                                  <w:t>Võ Chí Đức</w:t>
-                                </w:r>
-                              </w:p>
-                              <w:p>
-                                <w:pPr>
-                                  <w:spacing w:after="0"/>
-                                  <w:rPr>
-                                    <w:sz w:val="32"/>
-                                    <w:szCs w:val="32"/>
-                                  </w:rPr>
-                                </w:pPr>
-                                <w:r>
-                                  <w:rPr>
-                                    <w:sz w:val="32"/>
-                                    <w:szCs w:val="32"/>
-                                  </w:rPr>
-                                  <w:t xml:space="preserve">Lê Diệp </w:t>
-                                </w:r>
-                                <w:proofErr w:type="spellStart"/>
-                                <w:r>
-                                  <w:rPr>
-                                    <w:sz w:val="32"/>
-                                    <w:szCs w:val="32"/>
-                                  </w:rPr>
-                                  <w:t>Tấn</w:t>
-                                </w:r>
-                                <w:proofErr w:type="spellEnd"/>
-                                <w:r>
-                                  <w:rPr>
-                                    <w:sz w:val="32"/>
-                                    <w:szCs w:val="32"/>
-                                  </w:rPr>
-                                  <w:t xml:space="preserve"> Đạt</w:t>
-                                </w:r>
-                              </w:p>
+                              <w:tbl>
+                                <w:tblPr>
+                                  <w:tblStyle w:val="TableGrid"/>
+                                  <w:tblW w:w="8190" w:type="dxa"/>
+                                  <w:tblInd w:w="895" w:type="dxa"/>
+                                  <w:tblLook w:val="04A0" w:firstRow="1" w:lastRow="0" w:firstColumn="1" w:lastColumn="0" w:noHBand="0" w:noVBand="1"/>
+                                </w:tblPr>
+                                <w:tblGrid>
+                                  <w:gridCol w:w="2977"/>
+                                  <w:gridCol w:w="5213"/>
+                                </w:tblGrid>
+                                <w:tr>
+                                  <w:trPr>
+                                    <w:trHeight w:val="355"/>
+                                  </w:trPr>
+                                  <w:tc>
+                                    <w:tcPr>
+                                      <w:tcW w:w="2977" w:type="dxa"/>
+                                    </w:tcPr>
+                                    <w:p>
+                                      <w:pPr>
+                                        <w:rPr>
+                                          <w:sz w:val="32"/>
+                                          <w:szCs w:val="32"/>
+                                        </w:rPr>
+                                      </w:pPr>
+                                      <w:r>
+                                        <w:rPr>
+                                          <w:sz w:val="32"/>
+                                          <w:szCs w:val="32"/>
+                                        </w:rPr>
+                                        <w:t xml:space="preserve">Các </w:t>
+                                      </w:r>
+                                      <w:proofErr w:type="spellStart"/>
+                                      <w:r>
+                                        <w:rPr>
+                                          <w:sz w:val="32"/>
+                                          <w:szCs w:val="32"/>
+                                        </w:rPr>
+                                        <w:t>thành</w:t>
+                                      </w:r>
+                                      <w:proofErr w:type="spellEnd"/>
+                                      <w:r>
+                                        <w:rPr>
+                                          <w:sz w:val="32"/>
+                                          <w:szCs w:val="32"/>
+                                        </w:rPr>
+                                        <w:t xml:space="preserve"> </w:t>
+                                      </w:r>
+                                      <w:proofErr w:type="spellStart"/>
+                                      <w:r>
+                                        <w:rPr>
+                                          <w:sz w:val="32"/>
+                                          <w:szCs w:val="32"/>
+                                        </w:rPr>
+                                        <w:t>viên</w:t>
+                                      </w:r>
+                                      <w:proofErr w:type="spellEnd"/>
+                                      <w:r>
+                                        <w:rPr>
+                                          <w:sz w:val="32"/>
+                                          <w:szCs w:val="32"/>
+                                        </w:rPr>
+                                        <w:t>:</w:t>
+                                      </w:r>
+                                    </w:p>
+                                  </w:tc>
+                                  <w:tc>
+                                    <w:tcPr>
+                                      <w:tcW w:w="5213" w:type="dxa"/>
+                                    </w:tcPr>
+                                    <w:p>
+                                      <w:pPr>
+                                        <w:rPr>
+                                          <w:sz w:val="32"/>
+                                          <w:szCs w:val="32"/>
+                                        </w:rPr>
+                                      </w:pPr>
+                                    </w:p>
+                                  </w:tc>
+                                </w:tr>
+                                <w:tr>
+                                  <w:trPr>
+                                    <w:trHeight w:val="355"/>
+                                  </w:trPr>
+                                  <w:tc>
+                                    <w:tcPr>
+                                      <w:tcW w:w="2977" w:type="dxa"/>
+                                    </w:tcPr>
+                                    <w:p>
+                                      <w:pPr>
+                                        <w:rPr>
+                                          <w:sz w:val="32"/>
+                                          <w:szCs w:val="32"/>
+                                        </w:rPr>
+                                      </w:pPr>
+                                      <w:proofErr w:type="spellStart"/>
+                                      <w:r>
+                                        <w:rPr>
+                                          <w:sz w:val="32"/>
+                                          <w:szCs w:val="32"/>
+                                        </w:rPr>
+                                        <w:t>Trưởng</w:t>
+                                      </w:r>
+                                      <w:proofErr w:type="spellEnd"/>
+                                      <w:r>
+                                        <w:rPr>
+                                          <w:sz w:val="32"/>
+                                          <w:szCs w:val="32"/>
+                                        </w:rPr>
+                                        <w:t xml:space="preserve"> </w:t>
+                                      </w:r>
+                                      <w:proofErr w:type="spellStart"/>
+                                      <w:r>
+                                        <w:rPr>
+                                          <w:sz w:val="32"/>
+                                          <w:szCs w:val="32"/>
+                                        </w:rPr>
+                                        <w:t>nhóm</w:t>
+                                      </w:r>
+                                      <w:proofErr w:type="spellEnd"/>
+                                    </w:p>
+                                  </w:tc>
+                                  <w:tc>
+                                    <w:tcPr>
+                                      <w:tcW w:w="5213" w:type="dxa"/>
+                                    </w:tcPr>
+                                    <w:p>
+                                      <w:pPr>
+                                        <w:rPr>
+                                          <w:sz w:val="32"/>
+                                          <w:szCs w:val="32"/>
+                                        </w:rPr>
+                                      </w:pPr>
+                                      <w:r>
+                                        <w:rPr>
+                                          <w:sz w:val="32"/>
+                                          <w:szCs w:val="32"/>
+                                        </w:rPr>
+                                        <w:t>Nguyễn Phan Hoàng Tùng</w:t>
+                                      </w:r>
+                                    </w:p>
+                                  </w:tc>
+                                </w:tr>
+                                <w:tr>
+                                  <w:trPr>
+                                    <w:trHeight w:val="355"/>
+                                  </w:trPr>
+                                  <w:tc>
+                                    <w:tcPr>
+                                      <w:tcW w:w="2977" w:type="dxa"/>
+                                    </w:tcPr>
+                                    <w:p>
+                                      <w:pPr>
+                                        <w:rPr>
+                                          <w:sz w:val="32"/>
+                                          <w:szCs w:val="32"/>
+                                        </w:rPr>
+                                      </w:pPr>
+                                      <w:r>
+                                        <w:rPr>
+                                          <w:sz w:val="32"/>
+                                          <w:szCs w:val="32"/>
+                                        </w:rPr>
+                                        <w:t xml:space="preserve">Thành </w:t>
+                                      </w:r>
+                                      <w:proofErr w:type="spellStart"/>
+                                      <w:r>
+                                        <w:rPr>
+                                          <w:sz w:val="32"/>
+                                          <w:szCs w:val="32"/>
+                                        </w:rPr>
+                                        <w:t>viên</w:t>
+                                      </w:r>
+                                      <w:proofErr w:type="spellEnd"/>
+                                    </w:p>
+                                  </w:tc>
+                                  <w:tc>
+                                    <w:tcPr>
+                                      <w:tcW w:w="5213" w:type="dxa"/>
+                                    </w:tcPr>
+                                    <w:p>
+                                      <w:pPr>
+                                        <w:rPr>
+                                          <w:sz w:val="32"/>
+                                          <w:szCs w:val="32"/>
+                                        </w:rPr>
+                                      </w:pPr>
+                                      <w:proofErr w:type="spellStart"/>
+                                      <w:r>
+                                        <w:rPr>
+                                          <w:sz w:val="32"/>
+                                          <w:szCs w:val="32"/>
+                                        </w:rPr>
+                                        <w:t>Trần</w:t>
+                                      </w:r>
+                                      <w:proofErr w:type="spellEnd"/>
+                                      <w:r>
+                                        <w:rPr>
+                                          <w:sz w:val="32"/>
+                                          <w:szCs w:val="32"/>
+                                        </w:rPr>
+                                        <w:t xml:space="preserve"> </w:t>
+                                      </w:r>
+                                      <w:proofErr w:type="spellStart"/>
+                                      <w:r>
+                                        <w:rPr>
+                                          <w:sz w:val="32"/>
+                                          <w:szCs w:val="32"/>
+                                        </w:rPr>
+                                        <w:t>Hưng</w:t>
+                                      </w:r>
+                                      <w:proofErr w:type="spellEnd"/>
+                                      <w:r>
+                                        <w:rPr>
+                                          <w:sz w:val="32"/>
+                                          <w:szCs w:val="32"/>
+                                        </w:rPr>
+                                        <w:t xml:space="preserve"> Thịnh</w:t>
+                                      </w:r>
+                                    </w:p>
+                                  </w:tc>
+                                </w:tr>
+                                <w:tr>
+                                  <w:trPr>
+                                    <w:trHeight w:val="355"/>
+                                  </w:trPr>
+                                  <w:tc>
+                                    <w:tcPr>
+                                      <w:tcW w:w="2977" w:type="dxa"/>
+                                    </w:tcPr>
+                                    <w:p>
+                                      <w:pPr>
+                                        <w:rPr>
+                                          <w:sz w:val="32"/>
+                                          <w:szCs w:val="32"/>
+                                        </w:rPr>
+                                      </w:pPr>
+                                      <w:r>
+                                        <w:rPr>
+                                          <w:sz w:val="32"/>
+                                          <w:szCs w:val="32"/>
+                                        </w:rPr>
+                                        <w:t xml:space="preserve">Thành </w:t>
+                                      </w:r>
+                                      <w:proofErr w:type="spellStart"/>
+                                      <w:r>
+                                        <w:rPr>
+                                          <w:sz w:val="32"/>
+                                          <w:szCs w:val="32"/>
+                                        </w:rPr>
+                                        <w:t>viên</w:t>
+                                      </w:r>
+                                      <w:proofErr w:type="spellEnd"/>
+                                    </w:p>
+                                  </w:tc>
+                                  <w:tc>
+                                    <w:tcPr>
+                                      <w:tcW w:w="5213" w:type="dxa"/>
+                                    </w:tcPr>
+                                    <w:p>
+                                      <w:pPr>
+                                        <w:rPr>
+                                          <w:sz w:val="32"/>
+                                          <w:szCs w:val="32"/>
+                                        </w:rPr>
+                                      </w:pPr>
+                                      <w:r>
+                                        <w:rPr>
+                                          <w:sz w:val="32"/>
+                                          <w:szCs w:val="32"/>
+                                        </w:rPr>
+                                        <w:t>Lê Thị Tuyết Trinh</w:t>
+                                      </w:r>
+                                    </w:p>
+                                  </w:tc>
+                                </w:tr>
+                                <w:tr>
+                                  <w:trPr>
+                                    <w:trHeight w:val="355"/>
+                                  </w:trPr>
+                                  <w:tc>
+                                    <w:tcPr>
+                                      <w:tcW w:w="2977" w:type="dxa"/>
+                                    </w:tcPr>
+                                    <w:p>
+                                      <w:pPr>
+                                        <w:rPr>
+                                          <w:sz w:val="32"/>
+                                          <w:szCs w:val="32"/>
+                                        </w:rPr>
+                                      </w:pPr>
+                                      <w:r>
+                                        <w:rPr>
+                                          <w:sz w:val="32"/>
+                                          <w:szCs w:val="32"/>
+                                        </w:rPr>
+                                        <w:t xml:space="preserve">Thành </w:t>
+                                      </w:r>
+                                      <w:proofErr w:type="spellStart"/>
+                                      <w:r>
+                                        <w:rPr>
+                                          <w:sz w:val="32"/>
+                                          <w:szCs w:val="32"/>
+                                        </w:rPr>
+                                        <w:t>viên</w:t>
+                                      </w:r>
+                                      <w:proofErr w:type="spellEnd"/>
+                                    </w:p>
+                                  </w:tc>
+                                  <w:tc>
+                                    <w:tcPr>
+                                      <w:tcW w:w="5213" w:type="dxa"/>
+                                    </w:tcPr>
+                                    <w:p>
+                                      <w:pPr>
+                                        <w:rPr>
+                                          <w:sz w:val="32"/>
+                                          <w:szCs w:val="32"/>
+                                        </w:rPr>
+                                      </w:pPr>
+                                      <w:r>
+                                        <w:rPr>
+                                          <w:sz w:val="32"/>
+                                          <w:szCs w:val="32"/>
+                                        </w:rPr>
+                                        <w:t xml:space="preserve">Dương </w:t>
+                                      </w:r>
+                                      <w:proofErr w:type="spellStart"/>
+                                      <w:r>
+                                        <w:rPr>
+                                          <w:sz w:val="32"/>
+                                          <w:szCs w:val="32"/>
+                                        </w:rPr>
+                                        <w:t>Bách</w:t>
+                                      </w:r>
+                                      <w:proofErr w:type="spellEnd"/>
+                                      <w:r>
+                                        <w:rPr>
+                                          <w:sz w:val="32"/>
+                                          <w:szCs w:val="32"/>
+                                        </w:rPr>
+                                        <w:t xml:space="preserve"> Sang</w:t>
+                                      </w:r>
+                                    </w:p>
+                                  </w:tc>
+                                </w:tr>
+                                <w:tr>
+                                  <w:trPr>
+                                    <w:trHeight w:val="355"/>
+                                  </w:trPr>
+                                  <w:tc>
+                                    <w:tcPr>
+                                      <w:tcW w:w="2977" w:type="dxa"/>
+                                    </w:tcPr>
+                                    <w:p>
+                                      <w:pPr>
+                                        <w:rPr>
+                                          <w:sz w:val="32"/>
+                                          <w:szCs w:val="32"/>
+                                        </w:rPr>
+                                      </w:pPr>
+                                      <w:r>
+                                        <w:rPr>
+                                          <w:sz w:val="32"/>
+                                          <w:szCs w:val="32"/>
+                                        </w:rPr>
+                                        <w:t xml:space="preserve">Thành </w:t>
+                                      </w:r>
+                                      <w:proofErr w:type="spellStart"/>
+                                      <w:r>
+                                        <w:rPr>
+                                          <w:sz w:val="32"/>
+                                          <w:szCs w:val="32"/>
+                                        </w:rPr>
+                                        <w:t>viên</w:t>
+                                      </w:r>
+                                      <w:proofErr w:type="spellEnd"/>
+                                    </w:p>
+                                  </w:tc>
+                                  <w:tc>
+                                    <w:tcPr>
+                                      <w:tcW w:w="5213" w:type="dxa"/>
+                                    </w:tcPr>
+                                    <w:p>
+                                      <w:pPr>
+                                        <w:rPr>
+                                          <w:sz w:val="32"/>
+                                          <w:szCs w:val="32"/>
+                                        </w:rPr>
+                                      </w:pPr>
+                                      <w:r>
+                                        <w:rPr>
+                                          <w:sz w:val="32"/>
+                                          <w:szCs w:val="32"/>
+                                        </w:rPr>
+                                        <w:t>Võ Chí Đức</w:t>
+                                      </w:r>
+                                    </w:p>
+                                  </w:tc>
+                                </w:tr>
+                                <w:tr>
+                                  <w:trPr>
+                                    <w:trHeight w:val="355"/>
+                                  </w:trPr>
+                                  <w:tc>
+                                    <w:tcPr>
+                                      <w:tcW w:w="2977" w:type="dxa"/>
+                                    </w:tcPr>
+                                    <w:p>
+                                      <w:pPr>
+                                        <w:rPr>
+                                          <w:sz w:val="32"/>
+                                          <w:szCs w:val="32"/>
+                                        </w:rPr>
+                                      </w:pPr>
+                                      <w:r>
+                                        <w:rPr>
+                                          <w:sz w:val="32"/>
+                                          <w:szCs w:val="32"/>
+                                        </w:rPr>
+                                        <w:t xml:space="preserve">Thành </w:t>
+                                      </w:r>
+                                      <w:proofErr w:type="spellStart"/>
+                                      <w:r>
+                                        <w:rPr>
+                                          <w:sz w:val="32"/>
+                                          <w:szCs w:val="32"/>
+                                        </w:rPr>
+                                        <w:t>viên</w:t>
+                                      </w:r>
+                                      <w:proofErr w:type="spellEnd"/>
+                                    </w:p>
+                                  </w:tc>
+                                  <w:tc>
+                                    <w:tcPr>
+                                      <w:tcW w:w="5213" w:type="dxa"/>
+                                    </w:tcPr>
+                                    <w:p>
+                                      <w:pPr>
+                                        <w:rPr>
+                                          <w:sz w:val="32"/>
+                                          <w:szCs w:val="32"/>
+                                        </w:rPr>
+                                      </w:pPr>
+                                      <w:r>
+                                        <w:rPr>
+                                          <w:sz w:val="32"/>
+                                          <w:szCs w:val="32"/>
+                                        </w:rPr>
+                                        <w:t xml:space="preserve">Lê Diệp </w:t>
+                                      </w:r>
+                                      <w:proofErr w:type="spellStart"/>
+                                      <w:r>
+                                        <w:rPr>
+                                          <w:sz w:val="32"/>
+                                          <w:szCs w:val="32"/>
+                                        </w:rPr>
+                                        <w:t>Tấn</w:t>
+                                      </w:r>
+                                      <w:proofErr w:type="spellEnd"/>
+                                      <w:r>
+                                        <w:rPr>
+                                          <w:sz w:val="32"/>
+                                          <w:szCs w:val="32"/>
+                                        </w:rPr>
+                                        <w:t xml:space="preserve"> Đạt</w:t>
+                                      </w:r>
+                                    </w:p>
+                                  </w:tc>
+                                </w:tr>
+                              </w:tbl>
                               <w:p>
                                 <w:pPr>
                                   <w:spacing w:after="0"/>
@@ -631,51 +1045,99 @@
                               </w:p>
                               <w:p>
                                 <w:pPr>
-                                  <w:spacing w:after="0"/>
+                                  <w:ind w:left="1440"/>
                                   <w:rPr>
-                                    <w:sz w:val="32"/>
-                                    <w:szCs w:val="32"/>
+                                    <w:sz w:val="24"/>
+                                    <w:szCs w:val="24"/>
                                   </w:rPr>
                                 </w:pPr>
+                                <w:proofErr w:type="spellStart"/>
                                 <w:r>
                                   <w:rPr>
+                                    <w:rFonts w:cs="Times New Roman"/>
                                     <w:sz w:val="32"/>
-                                    <w:szCs w:val="32"/>
                                   </w:rPr>
-                                  <w:t xml:space="preserve">GV HD: </w:t>
+                                  <w:t>Giảng</w:t>
+                                </w:r>
+                                <w:proofErr w:type="spellEnd"/>
+                                <w:r>
+                                  <w:rPr>
+                                    <w:rFonts w:cs="Times New Roman"/>
+                                    <w:sz w:val="32"/>
+                                  </w:rPr>
+                                  <w:t xml:space="preserve"> </w:t>
                                 </w:r>
                                 <w:proofErr w:type="spellStart"/>
                                 <w:r>
                                   <w:rPr>
+                                    <w:rFonts w:cs="Times New Roman"/>
                                     <w:sz w:val="32"/>
-                                    <w:szCs w:val="32"/>
+                                  </w:rPr>
+                                  <w:t>viên</w:t>
+                                </w:r>
+                                <w:proofErr w:type="spellEnd"/>
+                                <w:r>
+                                  <w:rPr>
+                                    <w:rFonts w:cs="Times New Roman"/>
+                                    <w:sz w:val="32"/>
+                                  </w:rPr>
+                                  <w:t xml:space="preserve"> </w:t>
+                                </w:r>
+                                <w:proofErr w:type="spellStart"/>
+                                <w:r>
+                                  <w:rPr>
+                                    <w:rFonts w:cs="Times New Roman"/>
+                                    <w:sz w:val="32"/>
+                                  </w:rPr>
+                                  <w:t>hướng</w:t>
+                                </w:r>
+                                <w:proofErr w:type="spellEnd"/>
+                                <w:r>
+                                  <w:rPr>
+                                    <w:rFonts w:cs="Times New Roman"/>
+                                    <w:sz w:val="32"/>
+                                  </w:rPr>
+                                  <w:t xml:space="preserve"> </w:t>
+                                </w:r>
+                                <w:proofErr w:type="spellStart"/>
+                                <w:r>
+                                  <w:rPr>
+                                    <w:rFonts w:cs="Times New Roman"/>
+                                    <w:sz w:val="32"/>
+                                  </w:rPr>
+                                  <w:t>dẫn</w:t>
+                                </w:r>
+                                <w:proofErr w:type="spellEnd"/>
+                                <w:r>
+                                  <w:rPr>
+                                    <w:rFonts w:cs="Times New Roman"/>
+                                    <w:sz w:val="32"/>
+                                  </w:rPr>
+                                  <w:t>:</w:t>
+                                </w:r>
+                                <w:r>
+                                  <w:rPr>
+                                    <w:rFonts w:cs="Times New Roman"/>
+                                    <w:sz w:val="32"/>
+                                  </w:rPr>
+                                  <w:tab/>
+                                </w:r>
+                                <w:proofErr w:type="spellStart"/>
+                                <w:r>
+                                  <w:rPr>
+                                    <w:rFonts w:cs="Times New Roman"/>
+                                    <w:sz w:val="32"/>
                                   </w:rPr>
                                   <w:t>Thầy</w:t>
                                 </w:r>
                                 <w:proofErr w:type="spellEnd"/>
                                 <w:r>
                                   <w:rPr>
+                                    <w:rFonts w:cs="Times New Roman"/>
                                     <w:sz w:val="32"/>
-                                    <w:szCs w:val="32"/>
                                   </w:rPr>
-                                  <w:t xml:space="preserve"> </w:t>
+                                  <w:t xml:space="preserve"> Văn Công Khanh</w:t>
                                 </w:r>
-                                <w:r>
-                                  <w:rPr>
-                                    <w:sz w:val="32"/>
-                                    <w:szCs w:val="32"/>
-                                  </w:rPr>
-                                  <w:t>Văn Công Khanh</w:t>
-                                </w:r>
-                              </w:p>
-                              <w:p>
-                                <w:pPr>
-                                  <w:ind w:left="1440"/>
-                                  <w:rPr>
-                                    <w:sz w:val="24"/>
-                                    <w:szCs w:val="24"/>
-                                  </w:rPr>
-                                </w:pPr>
                               </w:p>
                               <w:p>
                                 <w:pPr>
@@ -705,27 +1167,109 @@
                               </w:p>
                               <w:p>
                                 <w:pPr>
+                                  <w:tabs>
+                                    <w:tab w:val="left" w:pos="3796"/>
+                                  </w:tabs>
                                   <w:jc w:val="center"/>
                                   <w:rPr>
-                                    <w:sz w:val="24"/>
-                                    <w:szCs w:val="24"/>
+                                    <w:rFonts w:cs="Times New Roman"/>
+                                    <w:b/>
+                                    <w:i/>
+                                    <w:color w:val="002060"/>
+                                    <w:sz w:val="36"/>
                                   </w:rPr>
                                 </w:pPr>
-                              </w:p>
-                              <w:p>
-                                <w:pPr>
-                                  <w:jc w:val="center"/>
-                                  <w:rPr>
-                                    <w:sz w:val="24"/>
-                                    <w:szCs w:val="24"/>
-                                  </w:rPr>
-                                </w:pPr>
+                                <w:proofErr w:type="spellStart"/>
                                 <w:r>
                                   <w:rPr>
-                                    <w:sz w:val="24"/>
-                                    <w:szCs w:val="24"/>
+                                    <w:rFonts w:cs="Times New Roman"/>
+                                    <w:b/>
+                                    <w:i/>
+                                    <w:color w:val="002060"/>
+                                    <w:sz w:val="36"/>
                                   </w:rPr>
-                                  <w:t>TP.HCM 5 - 2026</w:t>
+                                  <w:t>T</w:t>
+                                </w:r>
+                                <w:r>
+                                  <w:rPr>
+                                    <w:rFonts w:cs="Times New Roman"/>
+                                    <w:b/>
+                                    <w:i/>
+                                    <w:color w:val="002060"/>
+                                    <w:sz w:val="36"/>
+                                  </w:rPr>
+                                  <w:t>p.HCM</w:t>
+                                </w:r>
+                                <w:r>
+                                  <w:rPr>
+                                    <w:rFonts w:cs="Times New Roman"/>
+                                    <w:b/>
+                                    <w:i/>
+                                    <w:color w:val="002060"/>
+                                    <w:sz w:val="36"/>
+                                  </w:rPr>
+                                  <w:t>-</w:t>
+                                </w:r>
+                                <w:r>
+                                  <w:rPr>
+                                    <w:rFonts w:cs="Times New Roman"/>
+                                    <w:b/>
+                                    <w:i/>
+                                    <w:color w:val="002060"/>
+                                    <w:sz w:val="36"/>
+                                  </w:rPr>
+                                  <w:t>Tháng</w:t>
+                                </w:r>
+                                <w:proofErr w:type="spellEnd"/>
+                                <w:r>
+                                  <w:rPr>
+                                    <w:rFonts w:cs="Times New Roman"/>
+                                    <w:b/>
+                                    <w:i/>
+                                    <w:color w:val="002060"/>
+                                    <w:sz w:val="36"/>
+                                  </w:rPr>
+                                  <w:t xml:space="preserve"> </w:t>
+                                </w:r>
+                                <w:r>
+                                  <w:rPr>
+                                    <w:rFonts w:cs="Times New Roman"/>
+                                    <w:b/>
+                                    <w:i/>
+                                    <w:color w:val="002060"/>
+                                    <w:sz w:val="36"/>
+                                  </w:rPr>
+                                  <w:t>6</w:t>
+                                </w:r>
+                                <w:r>
+                                  <w:rPr>
+                                    <w:rFonts w:cs="Times New Roman"/>
+                                    <w:b/>
+                                    <w:i/>
+                                    <w:color w:val="002060"/>
+                                    <w:sz w:val="36"/>
+                                  </w:rPr>
+                                  <w:t xml:space="preserve"> Năm</w:t>
+                                </w:r>
+                                <w:r>
+                                  <w:rPr>
+                                    <w:rFonts w:cs="Times New Roman"/>
+                                    <w:b/>
+                                    <w:i/>
+                                    <w:color w:val="002060"/>
+                                    <w:sz w:val="36"/>
+                                  </w:rPr>
+                                  <w:t xml:space="preserve"> 20</w:t>
+                                </w:r>
+                                <w:r>
+                                  <w:rPr>
+                                    <w:rFonts w:cs="Times New Roman"/>
+                                    <w:b/>
+                                    <w:i/>
+                                    <w:color w:val="002060"/>
+                                    <w:sz w:val="36"/>
+                                  </w:rPr>
+                                  <w:t>26</w:t>
                                 </w:r>
                               </w:p>
                               <w:p>
@@ -952,172 +1496,291 @@
                         </w:p>
                         <w:p>
                           <w:pPr>
+                            <w:spacing w:before="240" w:after="0"/>
+                            <w:ind w:right="513"/>
                             <w:jc w:val="center"/>
                             <w:rPr>
-                              <w:rFonts w:asciiTheme="majorHAnsi" w:hAnsiTheme="majorHAnsi"/>
+                              <w:rFonts w:cs="Times New Roman"/>
                               <w:b/>
-                              <w:sz w:val="34"/>
-                              <w:szCs w:val="28"/>
+                              <w:color w:val="002060"/>
+                              <w:sz w:val="56"/>
+                              <w:szCs w:val="56"/>
                             </w:rPr>
                           </w:pPr>
                           <w:r>
                             <w:rPr>
-                              <w:rFonts w:asciiTheme="majorHAnsi" w:hAnsiTheme="majorHAnsi"/>
+                              <w:rFonts w:cs="Times New Roman"/>
                               <w:b/>
-                              <w:sz w:val="34"/>
-                              <w:szCs w:val="28"/>
+                              <w:color w:val="002060"/>
+                              <w:sz w:val="56"/>
+                              <w:szCs w:val="56"/>
                             </w:rPr>
-                            <w:t>BÁO CÁO DỰ ÁN TỐT NGHIỆP</w:t>
+                            <w:t>BÁO CÁO</w:t>
+                          </w:r>
+                          <w:r>
+                            <w:rPr>
+                              <w:rFonts w:cs="Times New Roman"/>
+                              <w:b/>
+                              <w:color w:val="002060"/>
+                              <w:sz w:val="56"/>
+                              <w:szCs w:val="56"/>
+                            </w:rPr>
+                            <w:t xml:space="preserve"> DỰ ÁN TỐT NGHIỆP</w:t>
                           </w:r>
                         </w:p>
                         <w:p>
                           <w:pPr>
+                            <w:spacing w:after="360"/>
+                            <w:ind w:right="513"/>
                             <w:jc w:val="center"/>
                             <w:rPr>
-                              <w:rFonts w:asciiTheme="majorHAnsi" w:hAnsiTheme="majorHAnsi"/>
+                              <w:rFonts w:cs="Times New Roman"/>
                               <w:b/>
+                              <w:color w:val="5B9BD5" w:themeColor="accent1"/>
                               <w:sz w:val="52"/>
-                              <w:szCs w:val="28"/>
+                              <w:szCs w:val="52"/>
+                              <w14:shadow w14:blurRad="69850" w14:dist="43180" w14:dir="5400000" w14:sx="0" w14:sy="0" w14:kx="0" w14:ky="0" w14:algn="none">
+                                <w14:srgbClr w14:val="000000">
+                                  <w14:alpha w14:val="35000"/>
+                                </w14:srgbClr>
+                              </w14:shadow>
+                              <w14:textOutline w14:w="952" w14:cap="flat" w14:cmpd="sng" w14:algn="ctr">
+                                <w14:noFill/>
+                                <w14:prstDash w14:val="solid"/>
+                                <w14:round/>
+                              </w14:textOutline>
+                              <w14:textFill>
+                                <w14:gradFill>
+                                  <w14:gsLst>
+                                    <w14:gs w14:pos="0">
+                                      <w14:schemeClr w14:val="accent6">
+                                        <w14:shade w14:val="20000"/>
+                                        <w14:satMod w14:val="200000"/>
+                                      </w14:schemeClr>
+                                    </w14:gs>
+                                    <w14:gs w14:pos="78000">
+                                      <w14:schemeClr w14:val="accent6">
+                                        <w14:tint w14:val="90000"/>
+                                        <w14:shade w14:val="89000"/>
+                                        <w14:satMod w14:val="220000"/>
+                                      </w14:schemeClr>
+                                    </w14:gs>
+                                    <w14:gs w14:pos="100000">
+                                      <w14:schemeClr w14:val="accent6">
+                                        <w14:tint w14:val="12000"/>
+                                        <w14:satMod w14:val="255000"/>
+                                      </w14:schemeClr>
+                                    </w14:gs>
+                                  </w14:gsLst>
+                                  <w14:lin w14:ang="5400000" w14:scaled="0"/>
+                                </w14:gradFill>
+                              </w14:textFill>
                             </w:rPr>
                           </w:pPr>
                           <w:r>
                             <w:rPr>
-                              <w:rFonts w:asciiTheme="majorHAnsi" w:hAnsiTheme="majorHAnsi"/>
-                              <w:b/>
-                              <w:sz w:val="34"/>
-                              <w:szCs w:val="28"/>
+                              <w:rFonts w:cs="Times New Roman"/>
+                              <w:color w:val="000000" w:themeColor="text1"/>
+                              <w:sz w:val="40"/>
+                              <w:szCs w:val="40"/>
+                              <w14:shadow w14:blurRad="38100" w14:dist="19050" w14:dir="2700000" w14:sx="100000" w14:sy="100000" w14:kx="0" w14:ky="0" w14:algn="tl">
+                                <w14:schemeClr w14:val="dk1">
+                                  <w14:alpha w14:val="60000"/>
+                                </w14:schemeClr>
+                              </w14:shadow>
+                              <w14:textOutline w14:w="0" w14:cap="flat" w14:cmpd="sng" w14:algn="ctr">
+                                <w14:noFill/>
+                                <w14:prstDash w14:val="solid"/>
+                                <w14:round/>
+                              </w14:textOutline>
                             </w:rPr>
-                            <w:t>Chuyên ngành Xử Lý Dữ Liệu</w:t>
+                            <w:t xml:space="preserve">Chuyên </w:t>
                           </w:r>
+                          <w:proofErr w:type="spellStart"/>
                           <w:r>
                             <w:rPr>
-                              <w:rFonts w:asciiTheme="majorHAnsi" w:hAnsiTheme="majorHAnsi"/>
-                              <w:b/>
-                              <w:sz w:val="34"/>
-                              <w:szCs w:val="28"/>
+                              <w:rFonts w:cs="Times New Roman"/>
+                              <w:color w:val="000000" w:themeColor="text1"/>
+                              <w:sz w:val="40"/>
+                              <w:szCs w:val="40"/>
+                              <w14:shadow w14:blurRad="38100" w14:dist="19050" w14:dir="2700000" w14:sx="100000" w14:sy="100000" w14:kx="0" w14:ky="0" w14:algn="tl">
+                                <w14:schemeClr w14:val="dk1">
+                                  <w14:alpha w14:val="60000"/>
+                                </w14:schemeClr>
+                              </w14:shadow>
+                              <w14:textOutline w14:w="0" w14:cap="flat" w14:cmpd="sng" w14:algn="ctr">
+                                <w14:noFill/>
+                                <w14:prstDash w14:val="solid"/>
+                                <w14:round/>
+                              </w14:textOutline>
                             </w:rPr>
-                            <w:br/>
+                            <w:t>ngành</w:t>
                           </w:r>
+                          <w:proofErr w:type="spellEnd"/>
                           <w:r>
                             <w:rPr>
-                              <w:rFonts w:ascii="Segoe UI" w:hAnsi="Segoe UI" w:cs="Segoe UI"/>
-                              <w:color w:val="081B3A"/>
-                              <w:spacing w:val="3"/>
-                              <w:sz w:val="23"/>
-                              <w:szCs w:val="23"/>
-                              <w:shd w:val="clear" w:color="auto" w:fill="FFFFFF"/>
+                              <w:rFonts w:cs="Times New Roman"/>
+                              <w:color w:val="000000" w:themeColor="text1"/>
+                              <w:sz w:val="40"/>
+                              <w:szCs w:val="40"/>
+                              <w14:shadow w14:blurRad="38100" w14:dist="19050" w14:dir="2700000" w14:sx="100000" w14:sy="100000" w14:kx="0" w14:ky="0" w14:algn="tl">
+                                <w14:schemeClr w14:val="dk1">
+                                  <w14:alpha w14:val="60000"/>
+                                </w14:schemeClr>
+                              </w14:shadow>
+                              <w14:textOutline w14:w="0" w14:cap="flat" w14:cmpd="sng" w14:algn="ctr">
+                                <w14:noFill/>
+                                <w14:prstDash w14:val="solid"/>
+                                <w14:round/>
+                              </w14:textOutline>
                             </w:rPr>
                             <w:t xml:space="preserve"> </w:t>
                           </w:r>
                           <w:proofErr w:type="spellStart"/>
                           <w:r>
                             <w:rPr>
-                              <w:rFonts w:ascii="Segoe UI" w:hAnsi="Segoe UI" w:cs="Segoe UI"/>
-                              <w:b/>
-                              <w:spacing w:val="3"/>
-                              <w:sz w:val="46"/>
-                              <w:szCs w:val="46"/>
-                              <w:shd w:val="clear" w:color="auto" w:fill="FFFFFF"/>
+                              <w:rFonts w:cs="Times New Roman"/>
+                              <w:color w:val="000000" w:themeColor="text1"/>
+                              <w:sz w:val="40"/>
+                              <w:szCs w:val="40"/>
+                              <w14:shadow w14:blurRad="38100" w14:dist="19050" w14:dir="2700000" w14:sx="100000" w14:sy="100000" w14:kx="0" w14:ky="0" w14:algn="tl">
+                                <w14:schemeClr w14:val="dk1">
+                                  <w14:alpha w14:val="60000"/>
+                                </w14:schemeClr>
+                              </w14:shadow>
+                              <w14:textOutline w14:w="0" w14:cap="flat" w14:cmpd="sng" w14:algn="ctr">
+                                <w14:noFill/>
+                                <w14:prstDash w14:val="solid"/>
+                                <w14:round/>
+                              </w14:textOutline>
                             </w:rPr>
-                            <w:t>Phân</w:t>
+                            <w:t>Xử</w:t>
                           </w:r>
                           <w:proofErr w:type="spellEnd"/>
                           <w:r>
                             <w:rPr>
-                              <w:rFonts w:ascii="Segoe UI" w:hAnsi="Segoe UI" w:cs="Segoe UI"/>
-                              <w:b/>
-                              <w:spacing w:val="3"/>
-                              <w:sz w:val="46"/>
-                              <w:szCs w:val="46"/>
-                              <w:shd w:val="clear" w:color="auto" w:fill="FFFFFF"/>
+                              <w:rFonts w:cs="Times New Roman"/>
+                              <w:color w:val="000000" w:themeColor="text1"/>
+                              <w:sz w:val="40"/>
+                              <w:szCs w:val="40"/>
+                              <w14:shadow w14:blurRad="38100" w14:dist="19050" w14:dir="2700000" w14:sx="100000" w14:sy="100000" w14:kx="0" w14:ky="0" w14:algn="tl">
+                                <w14:schemeClr w14:val="dk1">
+                                  <w14:alpha w14:val="60000"/>
+                                </w14:schemeClr>
+                              </w14:shadow>
+                              <w14:textOutline w14:w="0" w14:cap="flat" w14:cmpd="sng" w14:algn="ctr">
+                                <w14:noFill/>
+                                <w14:prstDash w14:val="solid"/>
+                                <w14:round/>
+                              </w14:textOutline>
                             </w:rPr>
-                            <w:t xml:space="preserve"> </w:t>
+                            <w:t xml:space="preserve"> Lý </w:t>
                           </w:r>
                           <w:proofErr w:type="spellStart"/>
                           <w:r>
                             <w:rPr>
-                              <w:rFonts w:ascii="Segoe UI" w:hAnsi="Segoe UI" w:cs="Segoe UI"/>
-                              <w:b/>
-                              <w:spacing w:val="3"/>
-                              <w:sz w:val="46"/>
-                              <w:szCs w:val="46"/>
-                              <w:shd w:val="clear" w:color="auto" w:fill="FFFFFF"/>
+                              <w:rFonts w:cs="Times New Roman"/>
+                              <w:color w:val="000000" w:themeColor="text1"/>
+                              <w:sz w:val="40"/>
+                              <w:szCs w:val="40"/>
+                              <w14:shadow w14:blurRad="38100" w14:dist="19050" w14:dir="2700000" w14:sx="100000" w14:sy="100000" w14:kx="0" w14:ky="0" w14:algn="tl">
+                                <w14:schemeClr w14:val="dk1">
+                                  <w14:alpha w14:val="60000"/>
+                                </w14:schemeClr>
+                              </w14:shadow>
+                              <w14:textOutline w14:w="0" w14:cap="flat" w14:cmpd="sng" w14:algn="ctr">
+                                <w14:noFill/>
+                                <w14:prstDash w14:val="solid"/>
+                                <w14:round/>
+                              </w14:textOutline>
                             </w:rPr>
-                            <w:t>Tích</w:t>
+                            <w:t>Dữ</w:t>
                           </w:r>
                           <w:proofErr w:type="spellEnd"/>
                           <w:r>
                             <w:rPr>
-                              <w:rFonts w:ascii="Segoe UI" w:hAnsi="Segoe UI" w:cs="Segoe UI"/>
-                              <w:b/>
-                              <w:spacing w:val="3"/>
-                              <w:sz w:val="46"/>
-                              <w:szCs w:val="46"/>
-                              <w:shd w:val="clear" w:color="auto" w:fill="FFFFFF"/>
+                              <w:rFonts w:cs="Times New Roman"/>
+                              <w:color w:val="000000" w:themeColor="text1"/>
+                              <w:sz w:val="40"/>
+                              <w:szCs w:val="40"/>
+                              <w14:shadow w14:blurRad="38100" w14:dist="19050" w14:dir="2700000" w14:sx="100000" w14:sy="100000" w14:kx="0" w14:ky="0" w14:algn="tl">
+                                <w14:schemeClr w14:val="dk1">
+                                  <w14:alpha w14:val="60000"/>
+                                </w14:schemeClr>
+                              </w14:shadow>
+                              <w14:textOutline w14:w="0" w14:cap="flat" w14:cmpd="sng" w14:algn="ctr">
+                                <w14:noFill/>
+                                <w14:prstDash w14:val="solid"/>
+                                <w14:round/>
+                              </w14:textOutline>
                             </w:rPr>
-                            <w:t xml:space="preserve"> </w:t>
+                            <w:t xml:space="preserve"> Liệu</w:t>
                           </w:r>
-                          <w:proofErr w:type="spellStart"/>
                           <w:r>
                             <w:rPr>
-                              <w:rFonts w:ascii="Segoe UI" w:hAnsi="Segoe UI" w:cs="Segoe UI"/>
-                              <w:b/>
-                              <w:spacing w:val="3"/>
-                              <w:sz w:val="46"/>
-                              <w:szCs w:val="46"/>
-                              <w:shd w:val="clear" w:color="auto" w:fill="FFFFFF"/>
+                              <w:rFonts w:asciiTheme="majorHAnsi" w:hAnsiTheme="majorHAnsi"/>
+                              <w:color w:val="000000" w:themeColor="text1"/>
+                              <w:sz w:val="34"/>
+                              <w:szCs w:val="28"/>
+                              <w14:shadow w14:blurRad="38100" w14:dist="19050" w14:dir="2700000" w14:sx="100000" w14:sy="100000" w14:kx="0" w14:ky="0" w14:algn="tl">
+                                <w14:schemeClr w14:val="dk1">
+                                  <w14:alpha w14:val="60000"/>
+                                </w14:schemeClr>
+                              </w14:shadow>
+                              <w14:textOutline w14:w="0" w14:cap="flat" w14:cmpd="sng" w14:algn="ctr">
+                                <w14:noFill/>
+                                <w14:prstDash w14:val="solid"/>
+                                <w14:round/>
+                              </w14:textOutline>
                             </w:rPr>
-                            <w:t>Rủi</w:t>
+                            <w:br/>
                           </w:r>
-                          <w:proofErr w:type="spellEnd"/>
                           <w:r>
                             <w:rPr>
-                              <w:rFonts w:ascii="Segoe UI" w:hAnsi="Segoe UI" w:cs="Segoe UI"/>
+                              <w:rFonts w:cs="Times New Roman"/>
                               <w:b/>
-                              <w:spacing w:val="3"/>
-                              <w:sz w:val="46"/>
-                              <w:szCs w:val="46"/>
-                              <w:shd w:val="clear" w:color="auto" w:fill="FFFFFF"/>
+                              <w:color w:val="5B9BD5" w:themeColor="accent1"/>
+                              <w:sz w:val="52"/>
+                              <w:szCs w:val="52"/>
+                              <w14:shadow w14:blurRad="69850" w14:dist="43180" w14:dir="5400000" w14:sx="0" w14:sy="0" w14:kx="0" w14:ky="0" w14:algn="none">
+                                <w14:srgbClr w14:val="000000">
+                                  <w14:alpha w14:val="35000"/>
+                                </w14:srgbClr>
+                              </w14:shadow>
+                              <w14:textOutline w14:w="952" w14:cap="flat" w14:cmpd="sng" w14:algn="ctr">
+                                <w14:noFill/>
+                                <w14:prstDash w14:val="solid"/>
+                                <w14:round/>
+                              </w14:textOutline>
+                              <w14:textFill>
+                                <w14:gradFill>
+                                  <w14:gsLst>
+                                    <w14:gs w14:pos="0">
+                                      <w14:schemeClr w14:val="accent6">
+                                        <w14:shade w14:val="20000"/>
+                                        <w14:satMod w14:val="200000"/>
+                                      </w14:schemeClr>
+                                    </w14:gs>
+                                    <w14:gs w14:pos="78000">
+                                      <w14:schemeClr w14:val="accent6">
+                                        <w14:tint w14:val="90000"/>
+                                        <w14:shade w14:val="89000"/>
+                                        <w14:satMod w14:val="220000"/>
+                                      </w14:schemeClr>
+                                    </w14:gs>
+                                    <w14:gs w14:pos="100000">
+                                      <w14:schemeClr w14:val="accent6">
+                                        <w14:tint w14:val="12000"/>
+                                        <w14:satMod w14:val="255000"/>
+                                      </w14:schemeClr>
+                                    </w14:gs>
+                                  </w14:gsLst>
+                                  <w14:lin w14:ang="5400000" w14:scaled="0"/>
+                                </w14:gradFill>
+                              </w14:textFill>
                             </w:rPr>
-                            <w:t xml:space="preserve"> Ro </w:t>
+                            <w:t>&lt;PHÂN TÍCH RỦI RO TÍN DỤNG&gt;</w:t>
                           </w:r>
-                          <w:proofErr w:type="spellStart"/>
-                          <w:r>
-                            <w:rPr>
-                              <w:rFonts w:ascii="Segoe UI" w:hAnsi="Segoe UI" w:cs="Segoe UI"/>
-                              <w:b/>
-                              <w:spacing w:val="3"/>
-                              <w:sz w:val="46"/>
-                              <w:szCs w:val="46"/>
-                              <w:shd w:val="clear" w:color="auto" w:fill="FFFFFF"/>
-                            </w:rPr>
-                            <w:t>Tín</w:t>
-                          </w:r>
-                          <w:proofErr w:type="spellEnd"/>
-                          <w:r>
-                            <w:rPr>
-                              <w:rFonts w:ascii="Segoe UI" w:hAnsi="Segoe UI" w:cs="Segoe UI"/>
-                              <w:b/>
-                              <w:spacing w:val="3"/>
-                              <w:sz w:val="46"/>
-                              <w:szCs w:val="46"/>
-                              <w:shd w:val="clear" w:color="auto" w:fill="FFFFFF"/>
-                            </w:rPr>
-                            <w:t xml:space="preserve"> </w:t>
-                          </w:r>
-                          <w:proofErr w:type="spellStart"/>
-                          <w:r>
-                            <w:rPr>
-                              <w:rFonts w:ascii="Segoe UI" w:hAnsi="Segoe UI" w:cs="Segoe UI"/>
-                              <w:b/>
-                              <w:spacing w:val="3"/>
-                              <w:sz w:val="46"/>
-                              <w:szCs w:val="46"/>
-                              <w:shd w:val="clear" w:color="auto" w:fill="FFFFFF"/>
-                            </w:rPr>
-                            <w:t>Dụng</w:t>
-                          </w:r>
-                          <w:proofErr w:type="spellEnd"/>
                         </w:p>
                         <w:p>
                           <w:pPr>
@@ -1150,9 +1813,33 @@
                               <w:sz w:val="40"/>
                               <w:szCs w:val="40"/>
                             </w:rPr>
-                            <w:t>NghienData</w:t>
+                            <w:t>Nghi</w:t>
+                          </w:r>
+                          <w:r>
+                            <w:rPr>
+                              <w:sz w:val="40"/>
+                              <w:szCs w:val="40"/>
+                            </w:rPr>
+                            <w:t>ện</w:t>
                           </w:r>
                           <w:proofErr w:type="spellEnd"/>
+                          <w:r>
+                            <w:rPr>
+                              <w:sz w:val="40"/>
+                              <w:szCs w:val="40"/>
+                            </w:rPr>
+                            <w:t xml:space="preserve"> Data</w:t>
+                          </w:r>
+                        </w:p>
+                        <w:p>
+                          <w:pPr>
+                            <w:spacing w:after="0"/>
+                            <w:jc w:val="center"/>
+                            <w:rPr>
+                              <w:sz w:val="40"/>
+                              <w:szCs w:val="40"/>
+                            </w:rPr>
+                          </w:pPr>
                         </w:p>
                         <w:p>
                           <w:pPr>
@@ -1164,207 +1851,478 @@
                             </w:rPr>
                           </w:pPr>
                         </w:p>
-                        <w:p>
-                          <w:pPr>
-                            <w:spacing w:after="0"/>
-                            <w:rPr>
-                              <w:sz w:val="32"/>
-                              <w:szCs w:val="32"/>
-                            </w:rPr>
-                          </w:pPr>
-                          <w:r>
-                            <w:rPr>
-                              <w:sz w:val="32"/>
-                              <w:szCs w:val="32"/>
-                            </w:rPr>
-                            <w:t xml:space="preserve">Các </w:t>
-                          </w:r>
-                          <w:proofErr w:type="spellStart"/>
-                          <w:r>
-                            <w:rPr>
-                              <w:sz w:val="32"/>
-                              <w:szCs w:val="32"/>
-                            </w:rPr>
-                            <w:t>thành</w:t>
-                          </w:r>
-                          <w:proofErr w:type="spellEnd"/>
-                          <w:r>
-                            <w:rPr>
-                              <w:sz w:val="32"/>
-                              <w:szCs w:val="32"/>
-                            </w:rPr>
-                            <w:t xml:space="preserve"> </w:t>
-                          </w:r>
-                          <w:proofErr w:type="spellStart"/>
-                          <w:r>
-                            <w:rPr>
-                              <w:sz w:val="32"/>
-                              <w:szCs w:val="32"/>
-                            </w:rPr>
-                            <w:t>viên</w:t>
-                          </w:r>
-                          <w:proofErr w:type="spellEnd"/>
-                          <w:r>
-                            <w:rPr>
-                              <w:sz w:val="32"/>
-                              <w:szCs w:val="32"/>
-                            </w:rPr>
-                            <w:t>:</w:t>
-                          </w:r>
-                        </w:p>
-                        <w:p>
-                          <w:pPr>
-                            <w:spacing w:after="0"/>
-                            <w:rPr>
-                              <w:sz w:val="32"/>
-                              <w:szCs w:val="32"/>
-                            </w:rPr>
-                          </w:pPr>
-                          <w:r>
-                            <w:rPr>
-                              <w:sz w:val="32"/>
-                              <w:szCs w:val="32"/>
-                            </w:rPr>
-                            <w:t>Nguyễn Phan Hoàng Tùng</w:t>
-                          </w:r>
-                        </w:p>
-                        <w:p>
-                          <w:pPr>
-                            <w:spacing w:after="0"/>
-                            <w:rPr>
-                              <w:sz w:val="32"/>
-                              <w:szCs w:val="32"/>
-                            </w:rPr>
-                          </w:pPr>
-                          <w:proofErr w:type="spellStart"/>
-                          <w:r>
-                            <w:rPr>
-                              <w:sz w:val="32"/>
-                              <w:szCs w:val="32"/>
-                            </w:rPr>
-                            <w:t>Trần</w:t>
-                          </w:r>
-                          <w:proofErr w:type="spellEnd"/>
-                          <w:r>
-                            <w:rPr>
-                              <w:sz w:val="32"/>
-                              <w:szCs w:val="32"/>
-                            </w:rPr>
-                            <w:t xml:space="preserve"> </w:t>
-                          </w:r>
-                          <w:proofErr w:type="spellStart"/>
-                          <w:r>
-                            <w:rPr>
-                              <w:sz w:val="32"/>
-                              <w:szCs w:val="32"/>
-                            </w:rPr>
-                            <w:t>Hưng</w:t>
-                          </w:r>
-                          <w:proofErr w:type="spellEnd"/>
-                          <w:r>
-                            <w:rPr>
-                              <w:sz w:val="32"/>
-                              <w:szCs w:val="32"/>
-                            </w:rPr>
-                            <w:t xml:space="preserve"> Thịnh</w:t>
-                          </w:r>
-                        </w:p>
-                        <w:p>
-                          <w:pPr>
-                            <w:spacing w:after="0"/>
-                            <w:rPr>
-                              <w:sz w:val="32"/>
-                              <w:szCs w:val="32"/>
-                            </w:rPr>
-                          </w:pPr>
-                          <w:r>
-                            <w:rPr>
-                              <w:sz w:val="32"/>
-                              <w:szCs w:val="32"/>
-                            </w:rPr>
-                            <w:t>Lê Thị Tuyết Trinh</w:t>
-                          </w:r>
-                        </w:p>
-                        <w:p>
-                          <w:pPr>
-                            <w:spacing w:after="0"/>
-                            <w:rPr>
-                              <w:sz w:val="32"/>
-                              <w:szCs w:val="32"/>
-                            </w:rPr>
-                          </w:pPr>
-                          <w:r>
-                            <w:rPr>
-                              <w:sz w:val="32"/>
-                              <w:szCs w:val="32"/>
-                            </w:rPr>
-                            <w:t xml:space="preserve">Dương </w:t>
-                          </w:r>
-                          <w:proofErr w:type="spellStart"/>
-                          <w:r>
-                            <w:rPr>
-                              <w:sz w:val="32"/>
-                              <w:szCs w:val="32"/>
-                            </w:rPr>
-                            <w:t>Bách</w:t>
-                          </w:r>
-                          <w:proofErr w:type="spellEnd"/>
-                          <w:r>
-                            <w:rPr>
-                              <w:sz w:val="32"/>
-                              <w:szCs w:val="32"/>
-                            </w:rPr>
-                            <w:t xml:space="preserve"> Sang</w:t>
-                          </w:r>
-                        </w:p>
-                        <w:p>
-                          <w:pPr>
-                            <w:spacing w:after="0"/>
-                            <w:rPr>
-                              <w:sz w:val="32"/>
-                              <w:szCs w:val="32"/>
-                            </w:rPr>
-                          </w:pPr>
-                          <w:r>
-                            <w:rPr>
-                              <w:sz w:val="32"/>
-                              <w:szCs w:val="32"/>
-                            </w:rPr>
-                            <w:t>Võ Chí Đức</w:t>
-                          </w:r>
-                        </w:p>
-                        <w:p>
-                          <w:pPr>
-                            <w:spacing w:after="0"/>
-                            <w:rPr>
-                              <w:sz w:val="32"/>
-                              <w:szCs w:val="32"/>
-                            </w:rPr>
-                          </w:pPr>
-                          <w:r>
-                            <w:rPr>
-                              <w:sz w:val="32"/>
-                              <w:szCs w:val="32"/>
-                            </w:rPr>
-                            <w:t xml:space="preserve">Lê Diệp </w:t>
-                          </w:r>
-                          <w:proofErr w:type="spellStart"/>
-                          <w:r>
-                            <w:rPr>
-                              <w:sz w:val="32"/>
-                              <w:szCs w:val="32"/>
-                            </w:rPr>
-                            <w:t>Tấn</w:t>
-                          </w:r>
-                          <w:proofErr w:type="spellEnd"/>
-                          <w:r>
-                            <w:rPr>
-                              <w:sz w:val="32"/>
-                              <w:szCs w:val="32"/>
-                            </w:rPr>
-                            <w:t xml:space="preserve"> Đạt</w:t>
-                          </w:r>
-                        </w:p>
+                        <w:tbl>
+                          <w:tblPr>
+                            <w:tblStyle w:val="TableGrid"/>
+                            <w:tblW w:w="8190" w:type="dxa"/>
+                            <w:tblInd w:w="895" w:type="dxa"/>
+                            <w:tblLook w:val="04A0" w:firstRow="1" w:lastRow="0" w:firstColumn="1" w:lastColumn="0" w:noHBand="0" w:noVBand="1"/>
+                          </w:tblPr>
+                          <w:tblGrid>
+                            <w:gridCol w:w="2977"/>
+                            <w:gridCol w:w="5213"/>
+                          </w:tblGrid>
+                          <w:tr>
+                            <w:trPr>
+                              <w:trHeight w:val="355"/>
+                            </w:trPr>
+                            <w:tc>
+                              <w:tcPr>
+                                <w:tcW w:w="2977" w:type="dxa"/>
+                              </w:tcPr>
+                              <w:p>
+                                <w:pPr>
+                                  <w:rPr>
+                                    <w:sz w:val="32"/>
+                                    <w:szCs w:val="32"/>
+                                  </w:rPr>
+                                </w:pPr>
+                                <w:r>
+                                  <w:rPr>
+                                    <w:sz w:val="32"/>
+                                    <w:szCs w:val="32"/>
+                                  </w:rPr>
+                                  <w:t xml:space="preserve">Các </w:t>
+                                </w:r>
+                                <w:proofErr w:type="spellStart"/>
+                                <w:r>
+                                  <w:rPr>
+                                    <w:sz w:val="32"/>
+                                    <w:szCs w:val="32"/>
+                                  </w:rPr>
+                                  <w:t>thành</w:t>
+                                </w:r>
+                                <w:proofErr w:type="spellEnd"/>
+                                <w:r>
+                                  <w:rPr>
+                                    <w:sz w:val="32"/>
+                                    <w:szCs w:val="32"/>
+                                  </w:rPr>
+                                  <w:t xml:space="preserve"> </w:t>
+                                </w:r>
+                                <w:proofErr w:type="spellStart"/>
+                                <w:r>
+                                  <w:rPr>
+                                    <w:sz w:val="32"/>
+                                    <w:szCs w:val="32"/>
+                                  </w:rPr>
+                                  <w:t>viên</w:t>
+                                </w:r>
+                                <w:proofErr w:type="spellEnd"/>
+                                <w:r>
+                                  <w:rPr>
+                                    <w:sz w:val="32"/>
+                                    <w:szCs w:val="32"/>
+                                  </w:rPr>
+                                  <w:t>:</w:t>
+                                </w:r>
+                              </w:p>
+                            </w:tc>
+                            <w:tc>
+                              <w:tcPr>
+                                <w:tcW w:w="5213" w:type="dxa"/>
+                              </w:tcPr>
+                              <w:p>
+                                <w:pPr>
+                                  <w:rPr>
+                                    <w:sz w:val="32"/>
+                                    <w:szCs w:val="32"/>
+                                  </w:rPr>
+                                </w:pPr>
+                              </w:p>
+                            </w:tc>
+                          </w:tr>
+                          <w:tr>
+                            <w:trPr>
+                              <w:trHeight w:val="355"/>
+                            </w:trPr>
+                            <w:tc>
+                              <w:tcPr>
+                                <w:tcW w:w="2977" w:type="dxa"/>
+                              </w:tcPr>
+                              <w:p>
+                                <w:pPr>
+                                  <w:rPr>
+                                    <w:sz w:val="32"/>
+                                    <w:szCs w:val="32"/>
+                                  </w:rPr>
+                                </w:pPr>
+                                <w:proofErr w:type="spellStart"/>
+                                <w:r>
+                                  <w:rPr>
+                                    <w:sz w:val="32"/>
+                                    <w:szCs w:val="32"/>
+                                  </w:rPr>
+                                  <w:t>Trưởng</w:t>
+                                </w:r>
+                                <w:proofErr w:type="spellEnd"/>
+                                <w:r>
+                                  <w:rPr>
+                                    <w:sz w:val="32"/>
+                                    <w:szCs w:val="32"/>
+                                  </w:rPr>
+                                  <w:t xml:space="preserve"> </w:t>
+                                </w:r>
+                                <w:proofErr w:type="spellStart"/>
+                                <w:r>
+                                  <w:rPr>
+                                    <w:sz w:val="32"/>
+                                    <w:szCs w:val="32"/>
+                                  </w:rPr>
+                                  <w:t>nhóm</w:t>
+                                </w:r>
+                                <w:proofErr w:type="spellEnd"/>
+                              </w:p>
+                            </w:tc>
+                            <w:tc>
+                              <w:tcPr>
+                                <w:tcW w:w="5213" w:type="dxa"/>
+                              </w:tcPr>
+                              <w:p>
+                                <w:pPr>
+                                  <w:rPr>
+                                    <w:sz w:val="32"/>
+                                    <w:szCs w:val="32"/>
+                                  </w:rPr>
+                                </w:pPr>
+                                <w:r>
+                                  <w:rPr>
+                                    <w:sz w:val="32"/>
+                                    <w:szCs w:val="32"/>
+                                  </w:rPr>
+                                  <w:t>Nguyễn Phan Hoàng Tùng</w:t>
+                                </w:r>
+                              </w:p>
+                            </w:tc>
+                          </w:tr>
+                          <w:tr>
+                            <w:trPr>
+                              <w:trHeight w:val="355"/>
+                            </w:trPr>
+                            <w:tc>
+                              <w:tcPr>
+                                <w:tcW w:w="2977" w:type="dxa"/>
+                              </w:tcPr>
+                              <w:p>
+                                <w:pPr>
+                                  <w:rPr>
+                                    <w:sz w:val="32"/>
+                                    <w:szCs w:val="32"/>
+                                  </w:rPr>
+                                </w:pPr>
+                                <w:r>
+                                  <w:rPr>
+                                    <w:sz w:val="32"/>
+                                    <w:szCs w:val="32"/>
+                                  </w:rPr>
+                                  <w:t xml:space="preserve">Thành </w:t>
+                                </w:r>
+                                <w:proofErr w:type="spellStart"/>
+                                <w:r>
+                                  <w:rPr>
+                                    <w:sz w:val="32"/>
+                                    <w:szCs w:val="32"/>
+                                  </w:rPr>
+                                  <w:t>viên</w:t>
+                                </w:r>
+                                <w:proofErr w:type="spellEnd"/>
+                              </w:p>
+                            </w:tc>
+                            <w:tc>
+                              <w:tcPr>
+                                <w:tcW w:w="5213" w:type="dxa"/>
+                              </w:tcPr>
+                              <w:p>
+                                <w:pPr>
+                                  <w:rPr>
+                                    <w:sz w:val="32"/>
+                                    <w:szCs w:val="32"/>
+                                  </w:rPr>
+                                </w:pPr>
+                                <w:proofErr w:type="spellStart"/>
+                                <w:r>
+                                  <w:rPr>
+                                    <w:sz w:val="32"/>
+                                    <w:szCs w:val="32"/>
+                                  </w:rPr>
+                                  <w:t>Trần</w:t>
+                                </w:r>
+                                <w:proofErr w:type="spellEnd"/>
+                                <w:r>
+                                  <w:rPr>
+                                    <w:sz w:val="32"/>
+                                    <w:szCs w:val="32"/>
+                                  </w:rPr>
+                                  <w:t xml:space="preserve"> </w:t>
+                                </w:r>
+                                <w:proofErr w:type="spellStart"/>
+                                <w:r>
+                                  <w:rPr>
+                                    <w:sz w:val="32"/>
+                                    <w:szCs w:val="32"/>
+                                  </w:rPr>
+                                  <w:t>Hưng</w:t>
+                                </w:r>
+                                <w:proofErr w:type="spellEnd"/>
+                                <w:r>
+                                  <w:rPr>
+                                    <w:sz w:val="32"/>
+                                    <w:szCs w:val="32"/>
+                                  </w:rPr>
+                                  <w:t xml:space="preserve"> Thịnh</w:t>
+                                </w:r>
+                              </w:p>
+                            </w:tc>
+                          </w:tr>
+                          <w:tr>
+                            <w:trPr>
+                              <w:trHeight w:val="355"/>
+                            </w:trPr>
+                            <w:tc>
+                              <w:tcPr>
+                                <w:tcW w:w="2977" w:type="dxa"/>
+                              </w:tcPr>
+                              <w:p>
+                                <w:pPr>
+                                  <w:rPr>
+                                    <w:sz w:val="32"/>
+                                    <w:szCs w:val="32"/>
+                                  </w:rPr>
+                                </w:pPr>
+                                <w:r>
+                                  <w:rPr>
+                                    <w:sz w:val="32"/>
+                                    <w:szCs w:val="32"/>
+                                  </w:rPr>
+                                  <w:t xml:space="preserve">Thành </w:t>
+                                </w:r>
+                                <w:proofErr w:type="spellStart"/>
+                                <w:r>
+                                  <w:rPr>
+                                    <w:sz w:val="32"/>
+                                    <w:szCs w:val="32"/>
+                                  </w:rPr>
+                                  <w:t>viên</w:t>
+                                </w:r>
+                                <w:proofErr w:type="spellEnd"/>
+                              </w:p>
+                            </w:tc>
+                            <w:tc>
+                              <w:tcPr>
+                                <w:tcW w:w="5213" w:type="dxa"/>
+                              </w:tcPr>
+                              <w:p>
+                                <w:pPr>
+                                  <w:rPr>
+                                    <w:sz w:val="32"/>
+                                    <w:szCs w:val="32"/>
+                                  </w:rPr>
+                                </w:pPr>
+                                <w:r>
+                                  <w:rPr>
+                                    <w:sz w:val="32"/>
+                                    <w:szCs w:val="32"/>
+                                  </w:rPr>
+                                  <w:t>Lê Thị Tuyết Trinh</w:t>
+                                </w:r>
+                              </w:p>
+                            </w:tc>
+                          </w:tr>
+                          <w:tr>
+                            <w:trPr>
+                              <w:trHeight w:val="355"/>
+                            </w:trPr>
+                            <w:tc>
+                              <w:tcPr>
+                                <w:tcW w:w="2977" w:type="dxa"/>
+                              </w:tcPr>
+                              <w:p>
+                                <w:pPr>
+                                  <w:rPr>
+                                    <w:sz w:val="32"/>
+                                    <w:szCs w:val="32"/>
+                                  </w:rPr>
+                                </w:pPr>
+                                <w:r>
+                                  <w:rPr>
+                                    <w:sz w:val="32"/>
+                                    <w:szCs w:val="32"/>
+                                  </w:rPr>
+                                  <w:t xml:space="preserve">Thành </w:t>
+                                </w:r>
+                                <w:proofErr w:type="spellStart"/>
+                                <w:r>
+                                  <w:rPr>
+                                    <w:sz w:val="32"/>
+                                    <w:szCs w:val="32"/>
+                                  </w:rPr>
+                                  <w:t>viên</w:t>
+                                </w:r>
+                                <w:proofErr w:type="spellEnd"/>
+                              </w:p>
+                            </w:tc>
+                            <w:tc>
+                              <w:tcPr>
+                                <w:tcW w:w="5213" w:type="dxa"/>
+                              </w:tcPr>
+                              <w:p>
+                                <w:pPr>
+                                  <w:rPr>
+                                    <w:sz w:val="32"/>
+                                    <w:szCs w:val="32"/>
+                                  </w:rPr>
+                                </w:pPr>
+                                <w:r>
+                                  <w:rPr>
+                                    <w:sz w:val="32"/>
+                                    <w:szCs w:val="32"/>
+                                  </w:rPr>
+                                  <w:t xml:space="preserve">Dương </w:t>
+                                </w:r>
+                                <w:proofErr w:type="spellStart"/>
+                                <w:r>
+                                  <w:rPr>
+                                    <w:sz w:val="32"/>
+                                    <w:szCs w:val="32"/>
+                                  </w:rPr>
+                                  <w:t>Bách</w:t>
+                                </w:r>
+                                <w:proofErr w:type="spellEnd"/>
+                                <w:r>
+                                  <w:rPr>
+                                    <w:sz w:val="32"/>
+                                    <w:szCs w:val="32"/>
+                                  </w:rPr>
+                                  <w:t xml:space="preserve"> Sang</w:t>
+                                </w:r>
+                              </w:p>
+                            </w:tc>
+                          </w:tr>
+                          <w:tr>
+                            <w:trPr>
+                              <w:trHeight w:val="355"/>
+                            </w:trPr>
+                            <w:tc>
+                              <w:tcPr>
+                                <w:tcW w:w="2977" w:type="dxa"/>
+                              </w:tcPr>
+                              <w:p>
+                                <w:pPr>
+                                  <w:rPr>
+                                    <w:sz w:val="32"/>
+                                    <w:szCs w:val="32"/>
+                                  </w:rPr>
+                                </w:pPr>
+                                <w:r>
+                                  <w:rPr>
+                                    <w:sz w:val="32"/>
+                                    <w:szCs w:val="32"/>
+                                  </w:rPr>
+                                  <w:t xml:space="preserve">Thành </w:t>
+                                </w:r>
+                                <w:proofErr w:type="spellStart"/>
+                                <w:r>
+                                  <w:rPr>
+                                    <w:sz w:val="32"/>
+                                    <w:szCs w:val="32"/>
+                                  </w:rPr>
+                                  <w:t>viên</w:t>
+                                </w:r>
+                                <w:proofErr w:type="spellEnd"/>
+                              </w:p>
+                            </w:tc>
+                            <w:tc>
+                              <w:tcPr>
+                                <w:tcW w:w="5213" w:type="dxa"/>
+                              </w:tcPr>
+                              <w:p>
+                                <w:pPr>
+                                  <w:rPr>
+                                    <w:sz w:val="32"/>
+                                    <w:szCs w:val="32"/>
+                                  </w:rPr>
+                                </w:pPr>
+                                <w:r>
+                                  <w:rPr>
+                                    <w:sz w:val="32"/>
+                                    <w:szCs w:val="32"/>
+                                  </w:rPr>
+                                  <w:t>Võ Chí Đức</w:t>
+                                </w:r>
+                              </w:p>
+                            </w:tc>
+                          </w:tr>
+                          <w:tr>
+                            <w:trPr>
+                              <w:trHeight w:val="355"/>
+                            </w:trPr>
+                            <w:tc>
+                              <w:tcPr>
+                                <w:tcW w:w="2977" w:type="dxa"/>
+                              </w:tcPr>
+                              <w:p>
+                                <w:pPr>
+                                  <w:rPr>
+                                    <w:sz w:val="32"/>
+                                    <w:szCs w:val="32"/>
+                                  </w:rPr>
+                                </w:pPr>
+                                <w:r>
+                                  <w:rPr>
+                                    <w:sz w:val="32"/>
+                                    <w:szCs w:val="32"/>
+                                  </w:rPr>
+                                  <w:t xml:space="preserve">Thành </w:t>
+                                </w:r>
+                                <w:proofErr w:type="spellStart"/>
+                                <w:r>
+                                  <w:rPr>
+                                    <w:sz w:val="32"/>
+                                    <w:szCs w:val="32"/>
+                                  </w:rPr>
+                                  <w:t>viên</w:t>
+                                </w:r>
+                                <w:proofErr w:type="spellEnd"/>
+                              </w:p>
+                            </w:tc>
+                            <w:tc>
+                              <w:tcPr>
+                                <w:tcW w:w="5213" w:type="dxa"/>
+                              </w:tcPr>
+                              <w:p>
+                                <w:pPr>
+                                  <w:rPr>
+                                    <w:sz w:val="32"/>
+                                    <w:szCs w:val="32"/>
+                                  </w:rPr>
+                                </w:pPr>
+                                <w:r>
+                                  <w:rPr>
+                                    <w:sz w:val="32"/>
+                                    <w:szCs w:val="32"/>
+                                  </w:rPr>
+                                  <w:t xml:space="preserve">Lê Diệp </w:t>
+                                </w:r>
+                                <w:proofErr w:type="spellStart"/>
+                                <w:r>
+                                  <w:rPr>
+                                    <w:sz w:val="32"/>
+                                    <w:szCs w:val="32"/>
+                                  </w:rPr>
+                                  <w:t>Tấn</w:t>
+                                </w:r>
+                                <w:proofErr w:type="spellEnd"/>
+                                <w:r>
+                                  <w:rPr>
+                                    <w:sz w:val="32"/>
+                                    <w:szCs w:val="32"/>
+                                  </w:rPr>
+                                  <w:t xml:space="preserve"> Đạt</w:t>
+                                </w:r>
+                              </w:p>
+                            </w:tc>
+                          </w:tr>
+                        </w:tbl>
                         <w:p>
                           <w:pPr>
                             <w:spacing w:after="0"/>
@@ -1376,51 +2334,99 @@
                         </w:p>
                         <w:p>
                           <w:pPr>
-                            <w:spacing w:after="0"/>
+                            <w:ind w:left="1440"/>
                             <w:rPr>
-                              <w:sz w:val="32"/>
-                              <w:szCs w:val="32"/>
+                              <w:sz w:val="24"/>
+                              <w:szCs w:val="24"/>
                             </w:rPr>
                           </w:pPr>
+                          <w:proofErr w:type="spellStart"/>
                           <w:r>
                             <w:rPr>
+                              <w:rFonts w:cs="Times New Roman"/>
                               <w:sz w:val="32"/>
-                              <w:szCs w:val="32"/>
                             </w:rPr>
-                            <w:t xml:space="preserve">GV HD: </w:t>
+                            <w:t>Giảng</w:t>
+                          </w:r>
+                          <w:proofErr w:type="spellEnd"/>
+                          <w:r>
+                            <w:rPr>
+                              <w:rFonts w:cs="Times New Roman"/>
+                              <w:sz w:val="32"/>
+                            </w:rPr>
+                            <w:t xml:space="preserve"> </w:t>
                           </w:r>
                           <w:proofErr w:type="spellStart"/>
                           <w:r>
                             <w:rPr>
+                              <w:rFonts w:cs="Times New Roman"/>
                               <w:sz w:val="32"/>
-                              <w:szCs w:val="32"/>
+                            </w:rPr>
+                            <w:t>viên</w:t>
+                          </w:r>
+                          <w:proofErr w:type="spellEnd"/>
+                          <w:r>
+                            <w:rPr>
+                              <w:rFonts w:cs="Times New Roman"/>
+                              <w:sz w:val="32"/>
+                            </w:rPr>
+                            <w:t xml:space="preserve"> </w:t>
+                          </w:r>
+                          <w:proofErr w:type="spellStart"/>
+                          <w:r>
+                            <w:rPr>
+                              <w:rFonts w:cs="Times New Roman"/>
+                              <w:sz w:val="32"/>
+                            </w:rPr>
+                            <w:t>hướng</w:t>
+                          </w:r>
+                          <w:proofErr w:type="spellEnd"/>
+                          <w:r>
+                            <w:rPr>
+                              <w:rFonts w:cs="Times New Roman"/>
+                              <w:sz w:val="32"/>
+                            </w:rPr>
+                            <w:t xml:space="preserve"> </w:t>
+                          </w:r>
+                          <w:proofErr w:type="spellStart"/>
+                          <w:r>
+                            <w:rPr>
+                              <w:rFonts w:cs="Times New Roman"/>
+                              <w:sz w:val="32"/>
+                            </w:rPr>
+                            <w:t>dẫn</w:t>
+                          </w:r>
+                          <w:proofErr w:type="spellEnd"/>
+                          <w:r>
+                            <w:rPr>
+                              <w:rFonts w:cs="Times New Roman"/>
+                              <w:sz w:val="32"/>
+                            </w:rPr>
+                            <w:t>:</w:t>
+                          </w:r>
+                          <w:r>
+                            <w:rPr>
+                              <w:rFonts w:cs="Times New Roman"/>
+                              <w:sz w:val="32"/>
+                            </w:rPr>
+                            <w:tab/>
+                          </w:r>
+                          <w:proofErr w:type="spellStart"/>
+                          <w:r>
+                            <w:rPr>
+                              <w:rFonts w:cs="Times New Roman"/>
+                              <w:sz w:val="32"/>
                             </w:rPr>
                             <w:t>Thầy</w:t>
                           </w:r>
                           <w:proofErr w:type="spellEnd"/>
                           <w:r>
                             <w:rPr>
+                              <w:rFonts w:cs="Times New Roman"/>
                               <w:sz w:val="32"/>
-                              <w:szCs w:val="32"/>
                             </w:rPr>
-                            <w:t xml:space="preserve"> </w:t>
+                            <w:t xml:space="preserve"> Văn Công Khanh</w:t>
                           </w:r>
-                          <w:r>
-                            <w:rPr>
-                              <w:sz w:val="32"/>
-                              <w:szCs w:val="32"/>
-                            </w:rPr>
-                            <w:t>Văn Công Khanh</w:t>
-                          </w:r>
-                        </w:p>
-                        <w:p>
-                          <w:pPr>
-                            <w:ind w:left="1440"/>
-                            <w:rPr>
-                              <w:sz w:val="24"/>
-                              <w:szCs w:val="24"/>
-                            </w:rPr>
-                          </w:pPr>
                         </w:p>
                         <w:p>
                           <w:pPr>
@@ -1450,27 +2456,109 @@
                         </w:p>
                         <w:p>
                           <w:pPr>
+                            <w:tabs>
+                              <w:tab w:val="left" w:pos="3796"/>
+                            </w:tabs>
                             <w:jc w:val="center"/>
                             <w:rPr>
-                              <w:sz w:val="24"/>
-                              <w:szCs w:val="24"/>
+                              <w:rFonts w:cs="Times New Roman"/>
+                              <w:b/>
+                              <w:i/>
+                              <w:color w:val="002060"/>
+                              <w:sz w:val="36"/>
                             </w:rPr>
                           </w:pPr>
-                        </w:p>
-                        <w:p>
-                          <w:pPr>
-                            <w:jc w:val="center"/>
-                            <w:rPr>
-                              <w:sz w:val="24"/>
-                              <w:szCs w:val="24"/>
-                            </w:rPr>
-                          </w:pPr>
+                          <w:proofErr w:type="spellStart"/>
                           <w:r>
                             <w:rPr>
-                              <w:sz w:val="24"/>
-                              <w:szCs w:val="24"/>
+                              <w:rFonts w:cs="Times New Roman"/>
+                              <w:b/>
+                              <w:i/>
+                              <w:color w:val="002060"/>
+                              <w:sz w:val="36"/>
                             </w:rPr>
-                            <w:t>TP.HCM 5 - 2026</w:t>
+                            <w:t>T</w:t>
+                          </w:r>
+                          <w:r>
+                            <w:rPr>
+                              <w:rFonts w:cs="Times New Roman"/>
+                              <w:b/>
+                              <w:i/>
+                              <w:color w:val="002060"/>
+                              <w:sz w:val="36"/>
+                            </w:rPr>
+                            <w:t>p.HCM</w:t>
+                          </w:r>
+                          <w:r>
+                            <w:rPr>
+                              <w:rFonts w:cs="Times New Roman"/>
+                              <w:b/>
+                              <w:i/>
+                              <w:color w:val="002060"/>
+                              <w:sz w:val="36"/>
+                            </w:rPr>
+                            <w:t>-</w:t>
+                          </w:r>
+                          <w:r>
+                            <w:rPr>
+                              <w:rFonts w:cs="Times New Roman"/>
+                              <w:b/>
+                              <w:i/>
+                              <w:color w:val="002060"/>
+                              <w:sz w:val="36"/>
+                            </w:rPr>
+                            <w:t>Tháng</w:t>
+                          </w:r>
+                          <w:proofErr w:type="spellEnd"/>
+                          <w:r>
+                            <w:rPr>
+                              <w:rFonts w:cs="Times New Roman"/>
+                              <w:b/>
+                              <w:i/>
+                              <w:color w:val="002060"/>
+                              <w:sz w:val="36"/>
+                            </w:rPr>
+                            <w:t xml:space="preserve"> </w:t>
+                          </w:r>
+                          <w:r>
+                            <w:rPr>
+                              <w:rFonts w:cs="Times New Roman"/>
+                              <w:b/>
+                              <w:i/>
+                              <w:color w:val="002060"/>
+                              <w:sz w:val="36"/>
+                            </w:rPr>
+                            <w:t>6</w:t>
+                          </w:r>
+                          <w:r>
+                            <w:rPr>
+                              <w:rFonts w:cs="Times New Roman"/>
+                              <w:b/>
+                              <w:i/>
+                              <w:color w:val="002060"/>
+                              <w:sz w:val="36"/>
+                            </w:rPr>
+                            <w:t xml:space="preserve"> Năm</w:t>
+                          </w:r>
+                          <w:r>
+                            <w:rPr>
+                              <w:rFonts w:cs="Times New Roman"/>
+                              <w:b/>
+                              <w:i/>
+                              <w:color w:val="002060"/>
+                              <w:sz w:val="36"/>
+                            </w:rPr>
+                            <w:t xml:space="preserve"> 20</w:t>
+                          </w:r>
+                          <w:r>
+                            <w:rPr>
+                              <w:rFonts w:cs="Times New Roman"/>
+                              <w:b/>
+                              <w:i/>
+                              <w:color w:val="002060"/>
+                              <w:sz w:val="36"/>
+                            </w:rPr>
+                            <w:t>26</w:t>
                           </w:r>
                         </w:p>
                         <w:p>
@@ -26279,22 +27367,13 @@
         </w:rPr>
         <w:t xml:space="preserve"> </w:t>
       </w:r>
-      <w:proofErr w:type="spellStart"/>
       <w:proofErr w:type="gramStart"/>
       <w:r>
         <w:rPr>
           <w:i/>
           <w:color w:val="00B050"/>
         </w:rPr>
-        <w:t>án</w:t>
-      </w:r>
-      <w:proofErr w:type="spellEnd"/>
-      <w:r>
-        <w:rPr>
-          <w:i/>
-          <w:color w:val="00B050"/>
-        </w:rPr>
-        <w:t xml:space="preserve"> ?</w:t>
+        <w:t>án ?</w:t>
       </w:r>
       <w:proofErr w:type="gramEnd"/>
       <w:r>
@@ -40009,6 +41088,7 @@
   <w:style w:type="character" w:default="1" w:styleId="DefaultParagraphFont">
     <w:name w:val="Default Paragraph Font"/>
     <w:uiPriority w:val="1"/>
+    <w:semiHidden/>
     <w:unhideWhenUsed/>
   </w:style>
   <w:style w:type="table" w:default="1" w:styleId="TableNormal">
@@ -40370,6 +41450,25 @@
       <w:bCs/>
     </w:rPr>
   </w:style>
+  <w:style w:type="table" w:styleId="TableGridLight">
+    <w:name w:val="Grid Table Light"/>
+    <w:basedOn w:val="TableNormal"/>
+    <w:uiPriority w:val="40"/>
+    <w:rsid w:val="00CA1F3A"/>
+    <w:pPr>
+      <w:spacing w:after="0" w:line="240" w:lineRule="auto"/>
+    </w:pPr>
+    <w:tblPr>
+      <w:tblBorders>
+        <w:top w:val="single" w:sz="4" w:space="0" w:color="BFBFBF" w:themeColor="background1" w:themeShade="BF"/>
+        <w:left w:val="single" w:sz="4" w:space="0" w:color="BFBFBF" w:themeColor="background1" w:themeShade="BF"/>
+        <w:bottom w:val="single" w:sz="4" w:space="0" w:color="BFBFBF" w:themeColor="background1" w:themeShade="BF"/>
+        <w:right w:val="single" w:sz="4" w:space="0" w:color="BFBFBF" w:themeColor="background1" w:themeShade="BF"/>
+        <w:insideH w:val="single" w:sz="4" w:space="0" w:color="BFBFBF" w:themeColor="background1" w:themeShade="BF"/>
+        <w:insideV w:val="single" w:sz="4" w:space="0" w:color="BFBFBF" w:themeColor="background1" w:themeShade="BF"/>
+      </w:tblBorders>
+    </w:tblPr>
+  </w:style>
 </w:styles>
 </file>
 

</xml_diff>

<commit_message>
Thông Tin thành viên_MSSV và thông tin cụ thể từng thàn hvieen
</commit_message>
<xml_diff>
--- a/docs/Báo Cáo NghienData.docx
+++ b/docs/Báo Cáo NghienData.docx
@@ -37,7 +37,7 @@
             <mc:AlternateContent>
               <mc:Choice Requires="wps">
                 <w:drawing>
-                  <wp:anchor distT="0" distB="0" distL="114300" distR="114300" simplePos="0" relativeHeight="251658240" behindDoc="0" locked="0" layoutInCell="1" allowOverlap="1" wp14:anchorId="07FDF2EB" wp14:editId="2BD5CEE2">
+                  <wp:anchor distT="0" distB="0" distL="114300" distR="114300" simplePos="0" relativeHeight="251658240" behindDoc="0" locked="0" layoutInCell="1" allowOverlap="1" wp14:anchorId="07FDF2EB" wp14:editId="7B70D759">
                     <wp:simplePos x="0" y="0"/>
                     <wp:positionH relativeFrom="margin">
                       <wp:posOffset>-409575</wp:posOffset>
@@ -498,6 +498,9 @@
                                   <w:spacing w:after="0"/>
                                   <w:jc w:val="center"/>
                                   <w:rPr>
+                                    <w:b/>
+                                    <w:bCs/>
+                                    <w:color w:val="000000" w:themeColor="text1"/>
                                     <w:sz w:val="40"/>
                                     <w:szCs w:val="40"/>
                                   </w:rPr>
@@ -505,6 +508,9 @@
                                 <w:proofErr w:type="spellStart"/>
                                 <w:r>
                                   <w:rPr>
+                                    <w:b/>
+                                    <w:bCs/>
+                                    <w:color w:val="000000" w:themeColor="text1"/>
                                     <w:sz w:val="40"/>
                                     <w:szCs w:val="40"/>
                                   </w:rPr>
@@ -513,6 +519,9 @@
                                 <w:proofErr w:type="spellEnd"/>
                                 <w:r>
                                   <w:rPr>
+                                    <w:b/>
+                                    <w:bCs/>
+                                    <w:color w:val="000000" w:themeColor="text1"/>
                                     <w:sz w:val="40"/>
                                     <w:szCs w:val="40"/>
                                   </w:rPr>
@@ -521,6 +530,9 @@
                                 <w:proofErr w:type="spellStart"/>
                                 <w:r>
                                   <w:rPr>
+                                    <w:b/>
+                                    <w:bCs/>
+                                    <w:color w:val="000000" w:themeColor="text1"/>
                                     <w:sz w:val="40"/>
                                     <w:szCs w:val="40"/>
                                   </w:rPr>
@@ -528,6 +540,9 @@
                                 </w:r>
                                 <w:r>
                                   <w:rPr>
+                                    <w:b/>
+                                    <w:bCs/>
+                                    <w:color w:val="000000" w:themeColor="text1"/>
                                     <w:sz w:val="40"/>
                                     <w:szCs w:val="40"/>
                                   </w:rPr>
@@ -536,6 +551,9 @@
                                 <w:proofErr w:type="spellEnd"/>
                                 <w:r>
                                   <w:rPr>
+                                    <w:b/>
+                                    <w:bCs/>
+                                    <w:color w:val="000000" w:themeColor="text1"/>
                                     <w:sz w:val="40"/>
                                     <w:szCs w:val="40"/>
                                   </w:rPr>
@@ -565,13 +583,14 @@
                               <w:tbl>
                                 <w:tblPr>
                                   <w:tblStyle w:val="TableGrid"/>
-                                  <w:tblW w:w="8190" w:type="dxa"/>
+                                  <w:tblW w:w="9440" w:type="dxa"/>
                                   <w:tblInd w:w="895" w:type="dxa"/>
                                   <w:tblLook w:val="04A0" w:firstRow="1" w:lastRow="0" w:firstColumn="1" w:lastColumn="0" w:noHBand="0" w:noVBand="1"/>
                                 </w:tblPr>
                                 <w:tblGrid>
-                                  <w:gridCol w:w="2977"/>
-                                  <w:gridCol w:w="5213"/>
+                                  <w:gridCol w:w="2248"/>
+                                  <w:gridCol w:w="3596"/>
+                                  <w:gridCol w:w="3596"/>
                                 </w:tblGrid>
                                 <w:tr>
                                   <w:trPr>
@@ -579,17 +598,21 @@
                                   </w:trPr>
                                   <w:tc>
                                     <w:tcPr>
-                                      <w:tcW w:w="2977" w:type="dxa"/>
+                                      <w:tcW w:w="2248" w:type="dxa"/>
                                     </w:tcPr>
                                     <w:p>
                                       <w:pPr>
                                         <w:rPr>
+                                          <w:b/>
+                                          <w:bCs/>
                                           <w:sz w:val="32"/>
                                           <w:szCs w:val="32"/>
                                         </w:rPr>
                                       </w:pPr>
                                       <w:r>
                                         <w:rPr>
+                                          <w:b/>
+                                          <w:bCs/>
                                           <w:sz w:val="32"/>
                                           <w:szCs w:val="32"/>
                                         </w:rPr>
@@ -598,6 +621,8 @@
                                       <w:proofErr w:type="spellStart"/>
                                       <w:r>
                                         <w:rPr>
+                                          <w:b/>
+                                          <w:bCs/>
                                           <w:sz w:val="32"/>
                                           <w:szCs w:val="32"/>
                                         </w:rPr>
@@ -606,6 +631,8 @@
                                       <w:proofErr w:type="spellEnd"/>
                                       <w:r>
                                         <w:rPr>
+                                          <w:b/>
+                                          <w:bCs/>
                                           <w:sz w:val="32"/>
                                           <w:szCs w:val="32"/>
                                         </w:rPr>
@@ -614,32 +641,146 @@
                                       <w:proofErr w:type="spellStart"/>
                                       <w:r>
                                         <w:rPr>
+                                          <w:b/>
+                                          <w:bCs/>
                                           <w:sz w:val="32"/>
                                           <w:szCs w:val="32"/>
                                         </w:rPr>
                                         <w:t>viên</w:t>
                                       </w:r>
                                       <w:proofErr w:type="spellEnd"/>
-                                      <w:r>
-                                        <w:rPr>
-                                          <w:sz w:val="32"/>
-                                          <w:szCs w:val="32"/>
-                                        </w:rPr>
-                                        <w:t>:</w:t>
-                                      </w:r>
                                     </w:p>
                                   </w:tc>
                                   <w:tc>
                                     <w:tcPr>
-                                      <w:tcW w:w="5213" w:type="dxa"/>
+                                      <w:tcW w:w="3596" w:type="dxa"/>
                                     </w:tcPr>
                                     <w:p>
                                       <w:pPr>
                                         <w:rPr>
+                                          <w:b/>
+                                          <w:bCs/>
                                           <w:sz w:val="32"/>
                                           <w:szCs w:val="32"/>
                                         </w:rPr>
                                       </w:pPr>
+                                      <w:proofErr w:type="spellStart"/>
+                                      <w:r>
+                                        <w:rPr>
+                                          <w:b/>
+                                          <w:bCs/>
+                                          <w:sz w:val="32"/>
+                                          <w:szCs w:val="32"/>
+                                        </w:rPr>
+                                        <w:t>Họ</w:t>
+                                      </w:r>
+                                      <w:proofErr w:type="spellEnd"/>
+                                      <w:r>
+                                        <w:rPr>
+                                          <w:b/>
+                                          <w:bCs/>
+                                          <w:sz w:val="32"/>
+                                          <w:szCs w:val="32"/>
+                                        </w:rPr>
+                                        <w:t xml:space="preserve"> </w:t>
+                                      </w:r>
+                                      <w:proofErr w:type="spellStart"/>
+                                      <w:r>
+                                        <w:rPr>
+                                          <w:b/>
+                                          <w:bCs/>
+                                          <w:sz w:val="32"/>
+                                          <w:szCs w:val="32"/>
+                                        </w:rPr>
+                                        <w:t>và</w:t>
+                                      </w:r>
+                                      <w:proofErr w:type="spellEnd"/>
+                                      <w:r>
+                                        <w:rPr>
+                                          <w:b/>
+                                          <w:bCs/>
+                                          <w:sz w:val="32"/>
+                                          <w:szCs w:val="32"/>
+                                        </w:rPr>
+                                        <w:t xml:space="preserve"> </w:t>
+                                      </w:r>
+                                      <w:proofErr w:type="spellStart"/>
+                                      <w:r>
+                                        <w:rPr>
+                                          <w:b/>
+                                          <w:bCs/>
+                                          <w:sz w:val="32"/>
+                                          <w:szCs w:val="32"/>
+                                        </w:rPr>
+                                        <w:t>tên</w:t>
+                                      </w:r>
+                                      <w:proofErr w:type="spellEnd"/>
+                                    </w:p>
+                                  </w:tc>
+                                  <w:tc>
+                                    <w:tcPr>
+                                      <w:tcW w:w="3596" w:type="dxa"/>
+                                    </w:tcPr>
+                                    <w:p>
+                                      <w:pPr>
+                                        <w:rPr>
+                                          <w:b/>
+                                          <w:bCs/>
+                                          <w:sz w:val="32"/>
+                                          <w:szCs w:val="32"/>
+                                        </w:rPr>
+                                      </w:pPr>
+                                      <w:proofErr w:type="spellStart"/>
+                                      <w:r>
+                                        <w:rPr>
+                                          <w:b/>
+                                          <w:bCs/>
+                                          <w:sz w:val="32"/>
+                                          <w:szCs w:val="32"/>
+                                        </w:rPr>
+                                        <w:t>Mã</w:t>
+                                      </w:r>
+                                      <w:proofErr w:type="spellEnd"/>
+                                      <w:r>
+                                        <w:rPr>
+                                          <w:b/>
+                                          <w:bCs/>
+                                          <w:sz w:val="32"/>
+                                          <w:szCs w:val="32"/>
+                                        </w:rPr>
+                                        <w:t xml:space="preserve"> </w:t>
+                                      </w:r>
+                                      <w:proofErr w:type="spellStart"/>
+                                      <w:r>
+                                        <w:rPr>
+                                          <w:b/>
+                                          <w:bCs/>
+                                          <w:sz w:val="32"/>
+                                          <w:szCs w:val="32"/>
+                                        </w:rPr>
+                                        <w:t>sinh</w:t>
+                                      </w:r>
+                                      <w:proofErr w:type="spellEnd"/>
+                                      <w:r>
+                                        <w:rPr>
+                                          <w:b/>
+                                          <w:bCs/>
+                                          <w:sz w:val="32"/>
+                                          <w:szCs w:val="32"/>
+                                        </w:rPr>
+                                        <w:t xml:space="preserve"> </w:t>
+                                      </w:r>
+                                      <w:proofErr w:type="spellStart"/>
+                                      <w:r>
+                                        <w:rPr>
+                                          <w:b/>
+                                          <w:bCs/>
+                                          <w:sz w:val="32"/>
+                                          <w:szCs w:val="32"/>
+                                        </w:rPr>
+                                        <w:t>viên</w:t>
+                                      </w:r>
+                                      <w:proofErr w:type="spellEnd"/>
                                     </w:p>
                                   </w:tc>
                                 </w:tr>
@@ -649,7 +790,7 @@
                                   </w:trPr>
                                   <w:tc>
                                     <w:tcPr>
-                                      <w:tcW w:w="2977" w:type="dxa"/>
+                                      <w:tcW w:w="2248" w:type="dxa"/>
                                     </w:tcPr>
                                     <w:p>
                                       <w:pPr>
@@ -687,7 +828,7 @@
                                   </w:tc>
                                   <w:tc>
                                     <w:tcPr>
-                                      <w:tcW w:w="5213" w:type="dxa"/>
+                                      <w:tcW w:w="3596" w:type="dxa"/>
                                     </w:tcPr>
                                     <w:p>
                                       <w:pPr>
@@ -705,6 +846,26 @@
                                       </w:r>
                                     </w:p>
                                   </w:tc>
+                                  <w:tc>
+                                    <w:tcPr>
+                                      <w:tcW w:w="3596" w:type="dxa"/>
+                                    </w:tcPr>
+                                    <w:p>
+                                      <w:pPr>
+                                        <w:rPr>
+                                          <w:sz w:val="32"/>
+                                          <w:szCs w:val="32"/>
+                                        </w:rPr>
+                                      </w:pPr>
+                                      <w:r>
+                                        <w:rPr>
+                                          <w:sz w:val="32"/>
+                                          <w:szCs w:val="32"/>
+                                        </w:rPr>
+                                        <w:t>PS44334</w:t>
+                                      </w:r>
+                                    </w:p>
+                                  </w:tc>
                                 </w:tr>
                                 <w:tr>
                                   <w:trPr>
@@ -712,7 +873,7 @@
                                   </w:trPr>
                                   <w:tc>
                                     <w:tcPr>
-                                      <w:tcW w:w="2977" w:type="dxa"/>
+                                      <w:tcW w:w="2248" w:type="dxa"/>
                                     </w:tcPr>
                                     <w:p>
                                       <w:pPr>
@@ -741,7 +902,7 @@
                                   </w:tc>
                                   <w:tc>
                                     <w:tcPr>
-                                      <w:tcW w:w="5213" w:type="dxa"/>
+                                      <w:tcW w:w="3596" w:type="dxa"/>
                                     </w:tcPr>
                                     <w:p>
                                       <w:pPr>
@@ -784,6 +945,26 @@
                                       </w:r>
                                     </w:p>
                                   </w:tc>
+                                  <w:tc>
+                                    <w:tcPr>
+                                      <w:tcW w:w="3596" w:type="dxa"/>
+                                    </w:tcPr>
+                                    <w:p>
+                                      <w:pPr>
+                                        <w:rPr>
+                                          <w:sz w:val="32"/>
+                                          <w:szCs w:val="32"/>
+                                        </w:rPr>
+                                      </w:pPr>
+                                      <w:r>
+                                        <w:rPr>
+                                          <w:sz w:val="32"/>
+                                          <w:szCs w:val="32"/>
+                                        </w:rPr>
+                                        <w:t>PS43939</w:t>
+                                      </w:r>
+                                    </w:p>
+                                  </w:tc>
                                 </w:tr>
                                 <w:tr>
                                   <w:trPr>
@@ -791,7 +972,7 @@
                                   </w:trPr>
                                   <w:tc>
                                     <w:tcPr>
-                                      <w:tcW w:w="2977" w:type="dxa"/>
+                                      <w:tcW w:w="2248" w:type="dxa"/>
                                     </w:tcPr>
                                     <w:p>
                                       <w:pPr>
@@ -820,7 +1001,7 @@
                                   </w:tc>
                                   <w:tc>
                                     <w:tcPr>
-                                      <w:tcW w:w="5213" w:type="dxa"/>
+                                      <w:tcW w:w="3596" w:type="dxa"/>
                                     </w:tcPr>
                                     <w:p>
                                       <w:pPr>
@@ -838,6 +1019,26 @@
                                       </w:r>
                                     </w:p>
                                   </w:tc>
+                                  <w:tc>
+                                    <w:tcPr>
+                                      <w:tcW w:w="3596" w:type="dxa"/>
+                                    </w:tcPr>
+                                    <w:p>
+                                      <w:pPr>
+                                        <w:rPr>
+                                          <w:sz w:val="32"/>
+                                          <w:szCs w:val="32"/>
+                                        </w:rPr>
+                                      </w:pPr>
+                                      <w:r>
+                                        <w:rPr>
+                                          <w:sz w:val="32"/>
+                                          <w:szCs w:val="32"/>
+                                        </w:rPr>
+                                        <w:t>PS45187</w:t>
+                                      </w:r>
+                                    </w:p>
+                                  </w:tc>
                                 </w:tr>
                                 <w:tr>
                                   <w:trPr>
@@ -845,7 +1046,7 @@
                                   </w:trPr>
                                   <w:tc>
                                     <w:tcPr>
-                                      <w:tcW w:w="2977" w:type="dxa"/>
+                                      <w:tcW w:w="2248" w:type="dxa"/>
                                     </w:tcPr>
                                     <w:p>
                                       <w:pPr>
@@ -874,7 +1075,7 @@
                                   </w:tc>
                                   <w:tc>
                                     <w:tcPr>
-                                      <w:tcW w:w="5213" w:type="dxa"/>
+                                      <w:tcW w:w="3596" w:type="dxa"/>
                                     </w:tcPr>
                                     <w:p>
                                       <w:pPr>
@@ -908,6 +1109,26 @@
                                       </w:r>
                                     </w:p>
                                   </w:tc>
+                                  <w:tc>
+                                    <w:tcPr>
+                                      <w:tcW w:w="3596" w:type="dxa"/>
+                                    </w:tcPr>
+                                    <w:p>
+                                      <w:pPr>
+                                        <w:rPr>
+                                          <w:sz w:val="32"/>
+                                          <w:szCs w:val="32"/>
+                                        </w:rPr>
+                                      </w:pPr>
+                                      <w:r>
+                                        <w:rPr>
+                                          <w:sz w:val="32"/>
+                                          <w:szCs w:val="32"/>
+                                        </w:rPr>
+                                        <w:t>PS45279</w:t>
+                                      </w:r>
+                                    </w:p>
+                                  </w:tc>
                                 </w:tr>
                                 <w:tr>
                                   <w:trPr>
@@ -915,7 +1136,7 @@
                                   </w:trPr>
                                   <w:tc>
                                     <w:tcPr>
-                                      <w:tcW w:w="2977" w:type="dxa"/>
+                                      <w:tcW w:w="2248" w:type="dxa"/>
                                     </w:tcPr>
                                     <w:p>
                                       <w:pPr>
@@ -944,7 +1165,7 @@
                                   </w:tc>
                                   <w:tc>
                                     <w:tcPr>
-                                      <w:tcW w:w="5213" w:type="dxa"/>
+                                      <w:tcW w:w="3596" w:type="dxa"/>
                                     </w:tcPr>
                                     <w:p>
                                       <w:pPr>
@@ -962,6 +1183,26 @@
                                       </w:r>
                                     </w:p>
                                   </w:tc>
+                                  <w:tc>
+                                    <w:tcPr>
+                                      <w:tcW w:w="3596" w:type="dxa"/>
+                                    </w:tcPr>
+                                    <w:p>
+                                      <w:pPr>
+                                        <w:rPr>
+                                          <w:sz w:val="32"/>
+                                          <w:szCs w:val="32"/>
+                                        </w:rPr>
+                                      </w:pPr>
+                                      <w:r>
+                                        <w:rPr>
+                                          <w:sz w:val="32"/>
+                                          <w:szCs w:val="32"/>
+                                        </w:rPr>
+                                        <w:t>PS45024</w:t>
+                                      </w:r>
+                                    </w:p>
+                                  </w:tc>
                                 </w:tr>
                                 <w:tr>
                                   <w:trPr>
@@ -969,7 +1210,7 @@
                                   </w:trPr>
                                   <w:tc>
                                     <w:tcPr>
-                                      <w:tcW w:w="2977" w:type="dxa"/>
+                                      <w:tcW w:w="2248" w:type="dxa"/>
                                     </w:tcPr>
                                     <w:p>
                                       <w:pPr>
@@ -998,7 +1239,7 @@
                                   </w:tc>
                                   <w:tc>
                                     <w:tcPr>
-                                      <w:tcW w:w="5213" w:type="dxa"/>
+                                      <w:tcW w:w="3596" w:type="dxa"/>
                                     </w:tcPr>
                                     <w:p>
                                       <w:pPr>
@@ -1029,6 +1270,26 @@
                                           <w:szCs w:val="32"/>
                                         </w:rPr>
                                         <w:t xml:space="preserve"> Đạt</w:t>
+                                      </w:r>
+                                    </w:p>
+                                  </w:tc>
+                                  <w:tc>
+                                    <w:tcPr>
+                                      <w:tcW w:w="3596" w:type="dxa"/>
+                                    </w:tcPr>
+                                    <w:p>
+                                      <w:pPr>
+                                        <w:rPr>
+                                          <w:sz w:val="32"/>
+                                          <w:szCs w:val="32"/>
+                                        </w:rPr>
+                                      </w:pPr>
+                                      <w:r>
+                                        <w:rPr>
+                                          <w:sz w:val="32"/>
+                                          <w:szCs w:val="32"/>
+                                        </w:rPr>
+                                        <w:t>PS44508</w:t>
                                       </w:r>
                                     </w:p>
                                   </w:tc>
@@ -1229,27 +1490,7 @@
                                     <w:color w:val="002060"/>
                                     <w:sz w:val="36"/>
                                   </w:rPr>
-                                  <w:t xml:space="preserve"> </w:t>
-                                </w:r>
-                                <w:r>
-                                  <w:rPr>
-                                    <w:rFonts w:cs="Times New Roman"/>
-                                    <w:b/>
-                                    <w:i/>
-                                    <w:color w:val="002060"/>
-                                    <w:sz w:val="36"/>
-                                  </w:rPr>
-                                  <w:t>6</w:t>
-                                </w:r>
-                                <w:r>
-                                  <w:rPr>
-                                    <w:rFonts w:cs="Times New Roman"/>
-                                    <w:b/>
-                                    <w:i/>
-                                    <w:color w:val="002060"/>
-                                    <w:sz w:val="36"/>
-                                  </w:rPr>
-                                  <w:t xml:space="preserve"> Năm</w:t>
+                                  <w:t xml:space="preserve"> 6 Năm</w:t>
                                 </w:r>
                                 <w:r>
                                   <w:rPr>
@@ -1787,6 +2028,9 @@
                             <w:spacing w:after="0"/>
                             <w:jc w:val="center"/>
                             <w:rPr>
+                              <w:b/>
+                              <w:bCs/>
+                              <w:color w:val="000000" w:themeColor="text1"/>
                               <w:sz w:val="40"/>
                               <w:szCs w:val="40"/>
                             </w:rPr>
@@ -1794,6 +2038,9 @@
                           <w:proofErr w:type="spellStart"/>
                           <w:r>
                             <w:rPr>
+                              <w:b/>
+                              <w:bCs/>
+                              <w:color w:val="000000" w:themeColor="text1"/>
                               <w:sz w:val="40"/>
                               <w:szCs w:val="40"/>
                             </w:rPr>
@@ -1802,6 +2049,9 @@
                           <w:proofErr w:type="spellEnd"/>
                           <w:r>
                             <w:rPr>
+                              <w:b/>
+                              <w:bCs/>
+                              <w:color w:val="000000" w:themeColor="text1"/>
                               <w:sz w:val="40"/>
                               <w:szCs w:val="40"/>
                             </w:rPr>
@@ -1810,6 +2060,9 @@
                           <w:proofErr w:type="spellStart"/>
                           <w:r>
                             <w:rPr>
+                              <w:b/>
+                              <w:bCs/>
+                              <w:color w:val="000000" w:themeColor="text1"/>
                               <w:sz w:val="40"/>
                               <w:szCs w:val="40"/>
                             </w:rPr>
@@ -1817,6 +2070,9 @@
                           </w:r>
                           <w:r>
                             <w:rPr>
+                              <w:b/>
+                              <w:bCs/>
+                              <w:color w:val="000000" w:themeColor="text1"/>
                               <w:sz w:val="40"/>
                               <w:szCs w:val="40"/>
                             </w:rPr>
@@ -1825,6 +2081,9 @@
                           <w:proofErr w:type="spellEnd"/>
                           <w:r>
                             <w:rPr>
+                              <w:b/>
+                              <w:bCs/>
+                              <w:color w:val="000000" w:themeColor="text1"/>
                               <w:sz w:val="40"/>
                               <w:szCs w:val="40"/>
                             </w:rPr>
@@ -1854,13 +2113,14 @@
                         <w:tbl>
                           <w:tblPr>
                             <w:tblStyle w:val="TableGrid"/>
-                            <w:tblW w:w="8190" w:type="dxa"/>
+                            <w:tblW w:w="9440" w:type="dxa"/>
                             <w:tblInd w:w="895" w:type="dxa"/>
                             <w:tblLook w:val="04A0" w:firstRow="1" w:lastRow="0" w:firstColumn="1" w:lastColumn="0" w:noHBand="0" w:noVBand="1"/>
                           </w:tblPr>
                           <w:tblGrid>
-                            <w:gridCol w:w="2977"/>
-                            <w:gridCol w:w="5213"/>
+                            <w:gridCol w:w="2248"/>
+                            <w:gridCol w:w="3596"/>
+                            <w:gridCol w:w="3596"/>
                           </w:tblGrid>
                           <w:tr>
                             <w:trPr>
@@ -1868,17 +2128,21 @@
                             </w:trPr>
                             <w:tc>
                               <w:tcPr>
-                                <w:tcW w:w="2977" w:type="dxa"/>
+                                <w:tcW w:w="2248" w:type="dxa"/>
                               </w:tcPr>
                               <w:p>
                                 <w:pPr>
                                   <w:rPr>
+                                    <w:b/>
+                                    <w:bCs/>
                                     <w:sz w:val="32"/>
                                     <w:szCs w:val="32"/>
                                   </w:rPr>
                                 </w:pPr>
                                 <w:r>
                                   <w:rPr>
+                                    <w:b/>
+                                    <w:bCs/>
                                     <w:sz w:val="32"/>
                                     <w:szCs w:val="32"/>
                                   </w:rPr>
@@ -1887,6 +2151,8 @@
                                 <w:proofErr w:type="spellStart"/>
                                 <w:r>
                                   <w:rPr>
+                                    <w:b/>
+                                    <w:bCs/>
                                     <w:sz w:val="32"/>
                                     <w:szCs w:val="32"/>
                                   </w:rPr>
@@ -1895,6 +2161,8 @@
                                 <w:proofErr w:type="spellEnd"/>
                                 <w:r>
                                   <w:rPr>
+                                    <w:b/>
+                                    <w:bCs/>
                                     <w:sz w:val="32"/>
                                     <w:szCs w:val="32"/>
                                   </w:rPr>
@@ -1903,32 +2171,146 @@
                                 <w:proofErr w:type="spellStart"/>
                                 <w:r>
                                   <w:rPr>
+                                    <w:b/>
+                                    <w:bCs/>
                                     <w:sz w:val="32"/>
                                     <w:szCs w:val="32"/>
                                   </w:rPr>
                                   <w:t>viên</w:t>
                                 </w:r>
                                 <w:proofErr w:type="spellEnd"/>
-                                <w:r>
-                                  <w:rPr>
-                                    <w:sz w:val="32"/>
-                                    <w:szCs w:val="32"/>
-                                  </w:rPr>
-                                  <w:t>:</w:t>
-                                </w:r>
                               </w:p>
                             </w:tc>
                             <w:tc>
                               <w:tcPr>
-                                <w:tcW w:w="5213" w:type="dxa"/>
+                                <w:tcW w:w="3596" w:type="dxa"/>
                               </w:tcPr>
                               <w:p>
                                 <w:pPr>
                                   <w:rPr>
+                                    <w:b/>
+                                    <w:bCs/>
                                     <w:sz w:val="32"/>
                                     <w:szCs w:val="32"/>
                                   </w:rPr>
                                 </w:pPr>
+                                <w:proofErr w:type="spellStart"/>
+                                <w:r>
+                                  <w:rPr>
+                                    <w:b/>
+                                    <w:bCs/>
+                                    <w:sz w:val="32"/>
+                                    <w:szCs w:val="32"/>
+                                  </w:rPr>
+                                  <w:t>Họ</w:t>
+                                </w:r>
+                                <w:proofErr w:type="spellEnd"/>
+                                <w:r>
+                                  <w:rPr>
+                                    <w:b/>
+                                    <w:bCs/>
+                                    <w:sz w:val="32"/>
+                                    <w:szCs w:val="32"/>
+                                  </w:rPr>
+                                  <w:t xml:space="preserve"> </w:t>
+                                </w:r>
+                                <w:proofErr w:type="spellStart"/>
+                                <w:r>
+                                  <w:rPr>
+                                    <w:b/>
+                                    <w:bCs/>
+                                    <w:sz w:val="32"/>
+                                    <w:szCs w:val="32"/>
+                                  </w:rPr>
+                                  <w:t>và</w:t>
+                                </w:r>
+                                <w:proofErr w:type="spellEnd"/>
+                                <w:r>
+                                  <w:rPr>
+                                    <w:b/>
+                                    <w:bCs/>
+                                    <w:sz w:val="32"/>
+                                    <w:szCs w:val="32"/>
+                                  </w:rPr>
+                                  <w:t xml:space="preserve"> </w:t>
+                                </w:r>
+                                <w:proofErr w:type="spellStart"/>
+                                <w:r>
+                                  <w:rPr>
+                                    <w:b/>
+                                    <w:bCs/>
+                                    <w:sz w:val="32"/>
+                                    <w:szCs w:val="32"/>
+                                  </w:rPr>
+                                  <w:t>tên</w:t>
+                                </w:r>
+                                <w:proofErr w:type="spellEnd"/>
+                              </w:p>
+                            </w:tc>
+                            <w:tc>
+                              <w:tcPr>
+                                <w:tcW w:w="3596" w:type="dxa"/>
+                              </w:tcPr>
+                              <w:p>
+                                <w:pPr>
+                                  <w:rPr>
+                                    <w:b/>
+                                    <w:bCs/>
+                                    <w:sz w:val="32"/>
+                                    <w:szCs w:val="32"/>
+                                  </w:rPr>
+                                </w:pPr>
+                                <w:proofErr w:type="spellStart"/>
+                                <w:r>
+                                  <w:rPr>
+                                    <w:b/>
+                                    <w:bCs/>
+                                    <w:sz w:val="32"/>
+                                    <w:szCs w:val="32"/>
+                                  </w:rPr>
+                                  <w:t>Mã</w:t>
+                                </w:r>
+                                <w:proofErr w:type="spellEnd"/>
+                                <w:r>
+                                  <w:rPr>
+                                    <w:b/>
+                                    <w:bCs/>
+                                    <w:sz w:val="32"/>
+                                    <w:szCs w:val="32"/>
+                                  </w:rPr>
+                                  <w:t xml:space="preserve"> </w:t>
+                                </w:r>
+                                <w:proofErr w:type="spellStart"/>
+                                <w:r>
+                                  <w:rPr>
+                                    <w:b/>
+                                    <w:bCs/>
+                                    <w:sz w:val="32"/>
+                                    <w:szCs w:val="32"/>
+                                  </w:rPr>
+                                  <w:t>sinh</w:t>
+                                </w:r>
+                                <w:proofErr w:type="spellEnd"/>
+                                <w:r>
+                                  <w:rPr>
+                                    <w:b/>
+                                    <w:bCs/>
+                                    <w:sz w:val="32"/>
+                                    <w:szCs w:val="32"/>
+                                  </w:rPr>
+                                  <w:t xml:space="preserve"> </w:t>
+                                </w:r>
+                                <w:proofErr w:type="spellStart"/>
+                                <w:r>
+                                  <w:rPr>
+                                    <w:b/>
+                                    <w:bCs/>
+                                    <w:sz w:val="32"/>
+                                    <w:szCs w:val="32"/>
+                                  </w:rPr>
+                                  <w:t>viên</w:t>
+                                </w:r>
+                                <w:proofErr w:type="spellEnd"/>
                               </w:p>
                             </w:tc>
                           </w:tr>
@@ -1938,7 +2320,7 @@
                             </w:trPr>
                             <w:tc>
                               <w:tcPr>
-                                <w:tcW w:w="2977" w:type="dxa"/>
+                                <w:tcW w:w="2248" w:type="dxa"/>
                               </w:tcPr>
                               <w:p>
                                 <w:pPr>
@@ -1976,7 +2358,7 @@
                             </w:tc>
                             <w:tc>
                               <w:tcPr>
-                                <w:tcW w:w="5213" w:type="dxa"/>
+                                <w:tcW w:w="3596" w:type="dxa"/>
                               </w:tcPr>
                               <w:p>
                                 <w:pPr>
@@ -1994,6 +2376,26 @@
                                 </w:r>
                               </w:p>
                             </w:tc>
+                            <w:tc>
+                              <w:tcPr>
+                                <w:tcW w:w="3596" w:type="dxa"/>
+                              </w:tcPr>
+                              <w:p>
+                                <w:pPr>
+                                  <w:rPr>
+                                    <w:sz w:val="32"/>
+                                    <w:szCs w:val="32"/>
+                                  </w:rPr>
+                                </w:pPr>
+                                <w:r>
+                                  <w:rPr>
+                                    <w:sz w:val="32"/>
+                                    <w:szCs w:val="32"/>
+                                  </w:rPr>
+                                  <w:t>PS44334</w:t>
+                                </w:r>
+                              </w:p>
+                            </w:tc>
                           </w:tr>
                           <w:tr>
                             <w:trPr>
@@ -2001,7 +2403,7 @@
                             </w:trPr>
                             <w:tc>
                               <w:tcPr>
-                                <w:tcW w:w="2977" w:type="dxa"/>
+                                <w:tcW w:w="2248" w:type="dxa"/>
                               </w:tcPr>
                               <w:p>
                                 <w:pPr>
@@ -2030,7 +2432,7 @@
                             </w:tc>
                             <w:tc>
                               <w:tcPr>
-                                <w:tcW w:w="5213" w:type="dxa"/>
+                                <w:tcW w:w="3596" w:type="dxa"/>
                               </w:tcPr>
                               <w:p>
                                 <w:pPr>
@@ -2073,6 +2475,26 @@
                                 </w:r>
                               </w:p>
                             </w:tc>
+                            <w:tc>
+                              <w:tcPr>
+                                <w:tcW w:w="3596" w:type="dxa"/>
+                              </w:tcPr>
+                              <w:p>
+                                <w:pPr>
+                                  <w:rPr>
+                                    <w:sz w:val="32"/>
+                                    <w:szCs w:val="32"/>
+                                  </w:rPr>
+                                </w:pPr>
+                                <w:r>
+                                  <w:rPr>
+                                    <w:sz w:val="32"/>
+                                    <w:szCs w:val="32"/>
+                                  </w:rPr>
+                                  <w:t>PS43939</w:t>
+                                </w:r>
+                              </w:p>
+                            </w:tc>
                           </w:tr>
                           <w:tr>
                             <w:trPr>
@@ -2080,7 +2502,7 @@
                             </w:trPr>
                             <w:tc>
                               <w:tcPr>
-                                <w:tcW w:w="2977" w:type="dxa"/>
+                                <w:tcW w:w="2248" w:type="dxa"/>
                               </w:tcPr>
                               <w:p>
                                 <w:pPr>
@@ -2109,7 +2531,7 @@
                             </w:tc>
                             <w:tc>
                               <w:tcPr>
-                                <w:tcW w:w="5213" w:type="dxa"/>
+                                <w:tcW w:w="3596" w:type="dxa"/>
                               </w:tcPr>
                               <w:p>
                                 <w:pPr>
@@ -2127,6 +2549,26 @@
                                 </w:r>
                               </w:p>
                             </w:tc>
+                            <w:tc>
+                              <w:tcPr>
+                                <w:tcW w:w="3596" w:type="dxa"/>
+                              </w:tcPr>
+                              <w:p>
+                                <w:pPr>
+                                  <w:rPr>
+                                    <w:sz w:val="32"/>
+                                    <w:szCs w:val="32"/>
+                                  </w:rPr>
+                                </w:pPr>
+                                <w:r>
+                                  <w:rPr>
+                                    <w:sz w:val="32"/>
+                                    <w:szCs w:val="32"/>
+                                  </w:rPr>
+                                  <w:t>PS45187</w:t>
+                                </w:r>
+                              </w:p>
+                            </w:tc>
                           </w:tr>
                           <w:tr>
                             <w:trPr>
@@ -2134,7 +2576,7 @@
                             </w:trPr>
                             <w:tc>
                               <w:tcPr>
-                                <w:tcW w:w="2977" w:type="dxa"/>
+                                <w:tcW w:w="2248" w:type="dxa"/>
                               </w:tcPr>
                               <w:p>
                                 <w:pPr>
@@ -2163,7 +2605,7 @@
                             </w:tc>
                             <w:tc>
                               <w:tcPr>
-                                <w:tcW w:w="5213" w:type="dxa"/>
+                                <w:tcW w:w="3596" w:type="dxa"/>
                               </w:tcPr>
                               <w:p>
                                 <w:pPr>
@@ -2197,6 +2639,26 @@
                                 </w:r>
                               </w:p>
                             </w:tc>
+                            <w:tc>
+                              <w:tcPr>
+                                <w:tcW w:w="3596" w:type="dxa"/>
+                              </w:tcPr>
+                              <w:p>
+                                <w:pPr>
+                                  <w:rPr>
+                                    <w:sz w:val="32"/>
+                                    <w:szCs w:val="32"/>
+                                  </w:rPr>
+                                </w:pPr>
+                                <w:r>
+                                  <w:rPr>
+                                    <w:sz w:val="32"/>
+                                    <w:szCs w:val="32"/>
+                                  </w:rPr>
+                                  <w:t>PS45279</w:t>
+                                </w:r>
+                              </w:p>
+                            </w:tc>
                           </w:tr>
                           <w:tr>
                             <w:trPr>
@@ -2204,7 +2666,7 @@
                             </w:trPr>
                             <w:tc>
                               <w:tcPr>
-                                <w:tcW w:w="2977" w:type="dxa"/>
+                                <w:tcW w:w="2248" w:type="dxa"/>
                               </w:tcPr>
                               <w:p>
                                 <w:pPr>
@@ -2233,7 +2695,7 @@
                             </w:tc>
                             <w:tc>
                               <w:tcPr>
-                                <w:tcW w:w="5213" w:type="dxa"/>
+                                <w:tcW w:w="3596" w:type="dxa"/>
                               </w:tcPr>
                               <w:p>
                                 <w:pPr>
@@ -2251,6 +2713,26 @@
                                 </w:r>
                               </w:p>
                             </w:tc>
+                            <w:tc>
+                              <w:tcPr>
+                                <w:tcW w:w="3596" w:type="dxa"/>
+                              </w:tcPr>
+                              <w:p>
+                                <w:pPr>
+                                  <w:rPr>
+                                    <w:sz w:val="32"/>
+                                    <w:szCs w:val="32"/>
+                                  </w:rPr>
+                                </w:pPr>
+                                <w:r>
+                                  <w:rPr>
+                                    <w:sz w:val="32"/>
+                                    <w:szCs w:val="32"/>
+                                  </w:rPr>
+                                  <w:t>PS45024</w:t>
+                                </w:r>
+                              </w:p>
+                            </w:tc>
                           </w:tr>
                           <w:tr>
                             <w:trPr>
@@ -2258,7 +2740,7 @@
                             </w:trPr>
                             <w:tc>
                               <w:tcPr>
-                                <w:tcW w:w="2977" w:type="dxa"/>
+                                <w:tcW w:w="2248" w:type="dxa"/>
                               </w:tcPr>
                               <w:p>
                                 <w:pPr>
@@ -2287,7 +2769,7 @@
                             </w:tc>
                             <w:tc>
                               <w:tcPr>
-                                <w:tcW w:w="5213" w:type="dxa"/>
+                                <w:tcW w:w="3596" w:type="dxa"/>
                               </w:tcPr>
                               <w:p>
                                 <w:pPr>
@@ -2318,6 +2800,26 @@
                                     <w:szCs w:val="32"/>
                                   </w:rPr>
                                   <w:t xml:space="preserve"> Đạt</w:t>
+                                </w:r>
+                              </w:p>
+                            </w:tc>
+                            <w:tc>
+                              <w:tcPr>
+                                <w:tcW w:w="3596" w:type="dxa"/>
+                              </w:tcPr>
+                              <w:p>
+                                <w:pPr>
+                                  <w:rPr>
+                                    <w:sz w:val="32"/>
+                                    <w:szCs w:val="32"/>
+                                  </w:rPr>
+                                </w:pPr>
+                                <w:r>
+                                  <w:rPr>
+                                    <w:sz w:val="32"/>
+                                    <w:szCs w:val="32"/>
+                                  </w:rPr>
+                                  <w:t>PS44508</w:t>
                                 </w:r>
                               </w:p>
                             </w:tc>
@@ -2518,27 +3020,7 @@
                               <w:color w:val="002060"/>
                               <w:sz w:val="36"/>
                             </w:rPr>
-                            <w:t xml:space="preserve"> </w:t>
-                          </w:r>
-                          <w:r>
-                            <w:rPr>
-                              <w:rFonts w:cs="Times New Roman"/>
-                              <w:b/>
-                              <w:i/>
-                              <w:color w:val="002060"/>
-                              <w:sz w:val="36"/>
-                            </w:rPr>
-                            <w:t>6</w:t>
-                          </w:r>
-                          <w:r>
-                            <w:rPr>
-                              <w:rFonts w:cs="Times New Roman"/>
-                              <w:b/>
-                              <w:i/>
-                              <w:color w:val="002060"/>
-                              <w:sz w:val="36"/>
-                            </w:rPr>
-                            <w:t xml:space="preserve"> Năm</w:t>
+                            <w:t xml:space="preserve"> 6 Năm</w:t>
                           </w:r>
                           <w:r>
                             <w:rPr>

</xml_diff>

<commit_message>
Chỉnh kiểu chữ của Docx 13/6
</commit_message>
<xml_diff>
--- a/docs/Báo Cáo NghienData.docx
+++ b/docs/Báo Cáo NghienData.docx
@@ -213,16 +213,16 @@
             <w:rPr>
               <w:b/>
               <w:bCs/>
-              <w:sz w:val="32"/>
-              <w:szCs w:val="32"/>
+              <w:sz w:val="30"/>
+              <w:szCs w:val="30"/>
             </w:rPr>
           </w:pPr>
           <w:r>
             <w:rPr>
               <w:b/>
               <w:bCs/>
-              <w:sz w:val="32"/>
-              <w:szCs w:val="32"/>
+              <w:sz w:val="30"/>
+              <w:szCs w:val="30"/>
             </w:rPr>
             <w:t>NHÓM: Nghiện Data</w:t>
           </w:r>

</xml_diff>